<commit_message>
Docs: rename beginner guide to ASCII; update tech doc for two-tier timebase
- Renamed report/新手操作指南.md -> report/beginner_guide.md (git mv,
  history preserved) and updated all references. The repo now contains
  zero non-ASCII file names, matching the open-source compliance claim
  in the submission checklist.
- Rebuilt the technical document (report/tech_doc_draft.docx) after
  clarifying that the timebase design implements four tiers while the
  delivered host UI exposes two (50 kHz / 12.5 kHz).
</commit_message>
<xml_diff>
--- a/report/tech_doc_draft.docx
+++ b/report/tech_doc_draft.docx
@@ -83,7 +83,7 @@
           <w:rFonts w:ascii="Times New Roman" w:hAnsi="Times New Roman" w:eastAsia="宋体"/>
           <w:sz w:val="24"/>
         </w:rPr>
-        <w:t xml:space="preserve">系统含六个功能单元：① 信号发生器，32 位 NCO 实现 1Hz~12.5MHz 任意频率、双音与三种波形；② 全参数测量，给出频率（100Hz~1MHz，误差&lt;1%）、峰峰值、占空比与脉宽，采用三层数字抗噪，并以“可信闸门”输出“其他”；③ 频谱分析，厂商 4096 点 FFT 与自研 1024 点 FFT 同板并存；④ 波形捕获，三种触发方式加 0%/25%/50%/75% 预触发；⑤ 512 点幅度谱帧，配合上位机呈现实时频谱与瀑布图；⑥ 时基四档（12.5k~200kHz），兼顾细分辨与宽范围。</w:t>
+        <w:t xml:space="preserve">系统含六个功能单元：① 信号发生器，32 位 NCO 实现 1Hz~12.5MHz 任意频率、双音与三种波形；② 全参数测量，给出频率（100Hz~1MHz，误差&lt;1%）、峰峰值、占空比与脉宽，采用三层数字抗噪，并以“可信闸门”输出“其他”；③ 频谱分析，厂商 4096 点 FFT 与自研 1024 点 FFT 同板并存；④ 波形捕获，三种触发方式加 0%/25%/50%/75% 预触发；⑤ 512 点幅度谱帧，配合上位机呈现实时频谱与瀑布图；⑥ 时基档位（固件四档 12.5k~200kHz），兼顾细分辨与宽范围。</w:t>
       </w:r>
     </w:p>
     <w:p>
@@ -329,7 +329,7 @@
           <w:rFonts w:ascii="Times New Roman" w:hAnsi="Times New Roman" w:eastAsia="宋体"/>
           <w:sz w:val="24"/>
         </w:rPr>
-        <w:t xml:space="preserve">（6）时基档位：12.5k/50k/100k/200kHz 四档等效采样率，频谱覆盖范围相应为 6.25k/25k/50k/100kHz，在“看得细”与“看得宽”之间灵活取舍。</w:t>
+        <w:t xml:space="preserve">（6）时基档位：12.5k/50k/100k/200kHz 四档等效采样率，频谱覆盖范围相应为 6.25k/25k/50k/100kHz，在“看得细”与“看得宽”之间灵活取舍（交付版本的上位机界面开放其中两档：50kHz 与 12.5kHz）。</w:t>
       </w:r>
     </w:p>
     <w:p>
@@ -885,7 +885,7 @@
                 <w:rFonts w:ascii="Times New Roman" w:hAnsi="Times New Roman" w:eastAsia="宋体"/>
                 <w:sz w:val="18"/>
               </w:rPr>
-              <w:t>四档：12.5k / 50k / 100k / 200kHz</w:t>
+              <w:t>固件四档：12.5k/50k/100k/200kHz（界面开放两档）</w:t>
             </w:r>
           </w:p>
         </w:tc>
@@ -1307,7 +1307,7 @@
           <w:rFonts w:ascii="Times New Roman" w:hAnsi="Times New Roman" w:eastAsia="宋体"/>
           <w:sz w:val="24"/>
         </w:rPr>
-        <w:t xml:space="preserve">（3）可配置时基四档：频谱覆盖 6.25k~100kHz，同一台仪器兼顾细分辨与宽范围。</w:t>
+        <w:t xml:space="preserve">（3）可配置时基档位：固件实现四档、频谱覆盖 6.25k~100kHz，同一台仪器兼顾细分辨与宽范围；交付版本界面开放 50kHz 与 12.5kHz 两档。</w:t>
       </w:r>
     </w:p>
     <w:p>
@@ -2589,7 +2589,7 @@
           <w:rFonts w:ascii="Times New Roman" w:hAnsi="Times New Roman" w:eastAsia="宋体"/>
           <w:sz w:val="24"/>
         </w:rPr>
-        <w:t xml:space="preserve">· 时基档位：四档全部上板验证，同一 1kHz 信号在四档中的谱峰分别落于 bin 20 / 82 / 10 / 5，与理论一致。</w:t>
+        <w:t xml:space="preserve">· 时基档位：固件四档全部上板验证，同一 1kHz 信号在四档中的谱峰分别落于 bin 20 / 82 / 10 / 5，与理论一致；交付版本界面开放 50kHz 与 12.5kHz 两档。</w:t>
       </w:r>
     </w:p>
     <w:p>

</xml_diff>

<commit_message>
Tech doc: add resource optimisation section with before/after tables
The official design-report checklist requires an 'optimisation process +
before/after comparison table', but the technical document only mentioned
the outcome in one line and told the story in the personal-reflection
section.

Adds section 2.4 covering:
- the place_design failure (20,829 LUTs required, 20,800 available)
- the opt_design side effect (19,231 -> 20,829 after retargeting)
- root cause: f_ram never inferred as block RAM because its read port
  carried an async reset, degrading to 32,768 FDREs plus a 4096:1
  read mux, consuming 86% of all LUTs
- the fix (single-port SDP template) and the result (-75.4% LUT)
- two tables: before/after resource comparison, and self-built FFT vs
  Xilinx IP core at the same bare-core scope
</commit_message>
<xml_diff>
--- a/report/tech_doc_draft.docx
+++ b/report/tech_doc_draft.docx
@@ -1978,6 +1978,1135 @@
         <w:t xml:space="preserve">上位机核心模块包括：串口收发线程（含自动重连）、上行帧解析器（区分测量行、谱峰行、波形帧与幅度谱帧）、界面刷新模块与数据记录模块。协议解析库提供命令构造函数（频率、波形、触发、时基、预触发、标定、谱帧请求等）与上行解析函数，并对全部命令帧做校验和自检；工具层则复用该库完成各自的专项测量。</w:t>
       </w:r>
     </w:p>
+    <w:p>
+      <w:pPr>
+        <w:rPr>
+          <w:rFonts w:ascii="Times New Roman" w:hAnsi="Times New Roman" w:eastAsia="宋体" w:cs="Times New Roman"/>
+          <w:b/>
+          <w:sz w:val="28"/>
+        </w:rPr>
+        <w:jc w:val="left"/>
+        <w:spacing w:line="360" w:lineRule="auto" w:after="60"/>
+      </w:pPr>
+      <w:r>
+        <w:rPr>
+          <w:rFonts w:ascii="Times New Roman" w:hAnsi="Times New Roman" w:eastAsia="宋体"/>
+          <w:sz w:val="26"/>
+          <w:b/>
+        </w:rPr>
+        <w:t xml:space="preserve">2.4 关键设计优化：从“超容”到 33.96%</w:t>
+      </w:r>
+    </w:p>
+    <w:p>
+      <w:pPr>
+        <w:rPr>
+          <w:rFonts w:ascii="Times New Roman" w:hAnsi="Times New Roman" w:eastAsia="宋体" w:cs="Times New Roman"/>
+          <w:b/>
+          <w:sz w:val="28"/>
+        </w:rPr>
+        <w:ind w:firstLineChars="200"/>
+        <w:spacing w:line="360" w:lineRule="auto"/>
+      </w:pPr>
+      <w:r>
+        <w:rPr>
+          <w:rFonts w:ascii="Times New Roman" w:hAnsi="Times New Roman" w:eastAsia="宋体"/>
+          <w:sz w:val="24"/>
+        </w:rPr>
+        <w:t xml:space="preserve">设计进入实现阶段时曾遇到一次致命问题：place_design 直接报错退出，提示“This design requires 20829 of such cell types but only 20800 compatible sites are available”。当时综合后的 Slice LUT 为 19,231（约 92%），看似尚有余量；但 opt_design 为优化时序执行了 retarget 与逻辑复制，LUT 反而升至 20,829，超出器件容量 29 个。</w:t>
+      </w:r>
+    </w:p>
+    <w:p>
+      <w:pPr>
+        <w:rPr>
+          <w:rFonts w:ascii="Times New Roman" w:hAnsi="Times New Roman" w:eastAsia="宋体" w:cs="Times New Roman"/>
+          <w:b/>
+          <w:sz w:val="28"/>
+        </w:rPr>
+        <w:ind w:firstLineChars="200"/>
+        <w:spacing w:line="360" w:lineRule="auto"/>
+      </w:pPr>
+      <w:r>
+        <w:rPr>
+          <w:rFonts w:ascii="Times New Roman" w:hAnsi="Times New Roman" w:eastAsia="宋体"/>
+          <w:sz w:val="24"/>
+        </w:rPr>
+        <w:t xml:space="preserve">定位方法不是看总数，而是按“实例名 ＋ 原语类型”逐项核查布局后资源报告。结果发现 fft_demo 中的波形缓存 f_ram（4096×8）虽已标注 block RAM 属性，实际并未落入块 RAM，而被综合成 32,768 个FDRE 外加一个 4096:1 的读多路选择器，独占全设计 86% 的 LUT 与 93% 的寄存器。根因在于该 RAM 的读端口带有异步复位——块 RAM 推断要求读口不复位，因而工具放弃推断，退回分布式寄存器实现。</w:t>
+      </w:r>
+    </w:p>
+    <w:p>
+      <w:pPr>
+        <w:rPr>
+          <w:rFonts w:ascii="Times New Roman" w:hAnsi="Times New Roman" w:eastAsia="宋体" w:cs="Times New Roman"/>
+          <w:b/>
+          <w:sz w:val="28"/>
+        </w:rPr>
+        <w:ind w:firstLineChars="200"/>
+        <w:spacing w:line="360" w:lineRule="auto"/>
+      </w:pPr>
+      <w:r>
+        <w:rPr>
+          <w:rFonts w:ascii="Times New Roman" w:hAnsi="Times New Roman" w:eastAsia="宋体"/>
+          <w:sz w:val="24"/>
+        </w:rPr>
+        <w:t xml:space="preserve">整改方式是将其改写为单端口 SDP（Simple Dual Port）模板：读端口去掉异步复位、读写各用独立的 always 块、地址按容量截位。改写后 LUT 由 20,829 降至 5,117、寄存器由 35,818 降至 4,834，实现一次通过。此后又陆续加入时基档位、Hann 窗与抛物线插值、幅度谱帧、预触发等功能，最终稳定在 LUT 33.96%、时序裕量 WNS +1.607 ns。</w:t>
+      </w:r>
+    </w:p>
+    <w:tbl>
+      <w:tblPr>
+        <w:tblW w:type="auto" w:w="0"/>
+        <w:jc w:val="center"/>
+        <w:tblLook w:firstColumn="1" w:firstRow="1" w:lastColumn="0" w:lastRow="0" w:noHBand="0" w:noVBand="1" w:val="04A0"/>
+        <w:tblBorders>
+          <w:top w:val="single" w:sz="12"/>
+          <w:bottom w:val="single" w:sz="12"/>
+          <w:left w:val="none"/>
+          <w:right w:val="none"/>
+          <w:insideH w:val="none"/>
+          <w:insideV w:val="none"/>
+        </w:tblBorders>
+        <w:tblLayout w:type="fixed"/>
+      </w:tblPr>
+      <w:tblGrid>
+        <w:gridCol w:w="2076"/>
+        <w:gridCol w:w="2076"/>
+        <w:gridCol w:w="2076"/>
+        <w:gridCol w:w="2076"/>
+      </w:tblGrid>
+      <w:tr>
+        <w:tc>
+          <w:tcPr>
+            <w:tcW w:type="dxa" w:w="2041"/>
+            <w:tcBorders>
+              <w:bottom w:val="single" w:sz="6"/>
+            </w:tcBorders>
+          </w:tcPr>
+          <w:p>
+            <w:pPr>
+              <w:spacing w:before="20" w:after="20"/>
+              <w:jc w:val="center"/>
+            </w:pPr>
+            <w:r>
+              <w:rPr>
+                <w:rFonts w:ascii="Times New Roman" w:hAnsi="Times New Roman" w:eastAsia="宋体"/>
+                <w:b/>
+                <w:sz w:val="18"/>
+              </w:rPr>
+              <w:t>阶段</w:t>
+            </w:r>
+          </w:p>
+        </w:tc>
+        <w:tc>
+          <w:tcPr>
+            <w:tcW w:type="dxa" w:w="2041"/>
+            <w:tcBorders>
+              <w:bottom w:val="single" w:sz="6"/>
+            </w:tcBorders>
+          </w:tcPr>
+          <w:p>
+            <w:pPr>
+              <w:spacing w:before="20" w:after="20"/>
+              <w:jc w:val="center"/>
+            </w:pPr>
+            <w:r>
+              <w:rPr>
+                <w:rFonts w:ascii="Times New Roman" w:hAnsi="Times New Roman" w:eastAsia="宋体"/>
+                <w:b/>
+                <w:sz w:val="18"/>
+              </w:rPr>
+              <w:t>Slice LUTs</w:t>
+            </w:r>
+          </w:p>
+        </w:tc>
+        <w:tc>
+          <w:tcPr>
+            <w:tcW w:type="dxa" w:w="2041"/>
+            <w:tcBorders>
+              <w:bottom w:val="single" w:sz="6"/>
+            </w:tcBorders>
+          </w:tcPr>
+          <w:p>
+            <w:pPr>
+              <w:spacing w:before="20" w:after="20"/>
+              <w:jc w:val="center"/>
+            </w:pPr>
+            <w:r>
+              <w:rPr>
+                <w:rFonts w:ascii="Times New Roman" w:hAnsi="Times New Roman" w:eastAsia="宋体"/>
+                <w:b/>
+                <w:sz w:val="18"/>
+              </w:rPr>
+              <w:t>Slice Registers</w:t>
+            </w:r>
+          </w:p>
+        </w:tc>
+        <w:tc>
+          <w:tcPr>
+            <w:tcW w:type="dxa" w:w="2041"/>
+            <w:tcBorders>
+              <w:bottom w:val="single" w:sz="6"/>
+            </w:tcBorders>
+          </w:tcPr>
+          <w:p>
+            <w:pPr>
+              <w:spacing w:before="20" w:after="20"/>
+              <w:jc w:val="center"/>
+            </w:pPr>
+            <w:r>
+              <w:rPr>
+                <w:rFonts w:ascii="Times New Roman" w:hAnsi="Times New Roman" w:eastAsia="宋体"/>
+                <w:b/>
+                <w:sz w:val="18"/>
+              </w:rPr>
+              <w:t>结论</w:t>
+            </w:r>
+          </w:p>
+        </w:tc>
+      </w:tr>
+      <w:tr>
+        <w:tc>
+          <w:tcPr>
+            <w:tcW w:type="dxa" w:w="2041"/>
+          </w:tcPr>
+          <w:p>
+            <w:pPr>
+              <w:spacing w:before="20" w:after="20"/>
+              <w:jc w:val="center"/>
+            </w:pPr>
+            <w:r>
+              <w:rPr>
+                <w:rFonts w:ascii="Times New Roman" w:hAnsi="Times New Roman" w:eastAsia="宋体"/>
+                <w:sz w:val="18"/>
+              </w:rPr>
+              <w:t>整改前（f_ram 未进 BRAM）</w:t>
+            </w:r>
+          </w:p>
+        </w:tc>
+        <w:tc>
+          <w:tcPr>
+            <w:tcW w:type="dxa" w:w="2041"/>
+          </w:tcPr>
+          <w:p>
+            <w:pPr>
+              <w:spacing w:before="20" w:after="20"/>
+              <w:jc w:val="center"/>
+            </w:pPr>
+            <w:r>
+              <w:rPr>
+                <w:rFonts w:ascii="Times New Roman" w:hAnsi="Times New Roman" w:eastAsia="宋体"/>
+                <w:sz w:val="18"/>
+              </w:rPr>
+              <w:t>20,829（100.14%）</w:t>
+            </w:r>
+          </w:p>
+        </w:tc>
+        <w:tc>
+          <w:tcPr>
+            <w:tcW w:type="dxa" w:w="2041"/>
+          </w:tcPr>
+          <w:p>
+            <w:pPr>
+              <w:spacing w:before="20" w:after="20"/>
+              <w:jc w:val="center"/>
+            </w:pPr>
+            <w:r>
+              <w:rPr>
+                <w:rFonts w:ascii="Times New Roman" w:hAnsi="Times New Roman" w:eastAsia="宋体"/>
+                <w:sz w:val="18"/>
+              </w:rPr>
+              <w:t>35,818（86.10%）</w:t>
+            </w:r>
+          </w:p>
+        </w:tc>
+        <w:tc>
+          <w:tcPr>
+            <w:tcW w:type="dxa" w:w="2041"/>
+          </w:tcPr>
+          <w:p>
+            <w:pPr>
+              <w:spacing w:before="20" w:after="20"/>
+              <w:jc w:val="center"/>
+            </w:pPr>
+            <w:r>
+              <w:rPr>
+                <w:rFonts w:ascii="Times New Roman" w:hAnsi="Times New Roman" w:eastAsia="宋体"/>
+                <w:sz w:val="18"/>
+              </w:rPr>
+              <w:t>超出容量 29 个，place_design 报错退出</w:t>
+            </w:r>
+          </w:p>
+        </w:tc>
+      </w:tr>
+      <w:tr>
+        <w:tc>
+          <w:tcPr>
+            <w:tcW w:type="dxa" w:w="2041"/>
+          </w:tcPr>
+          <w:p>
+            <w:pPr>
+              <w:spacing w:before="20" w:after="20"/>
+              <w:jc w:val="center"/>
+            </w:pPr>
+            <w:r>
+              <w:rPr>
+                <w:rFonts w:ascii="Times New Roman" w:hAnsi="Times New Roman" w:eastAsia="宋体"/>
+                <w:sz w:val="18"/>
+              </w:rPr>
+              <w:t>整改后（改用 SDP 模板）</w:t>
+            </w:r>
+          </w:p>
+        </w:tc>
+        <w:tc>
+          <w:tcPr>
+            <w:tcW w:type="dxa" w:w="2041"/>
+          </w:tcPr>
+          <w:p>
+            <w:pPr>
+              <w:spacing w:before="20" w:after="20"/>
+              <w:jc w:val="center"/>
+            </w:pPr>
+            <w:r>
+              <w:rPr>
+                <w:rFonts w:ascii="Times New Roman" w:hAnsi="Times New Roman" w:eastAsia="宋体"/>
+                <w:sz w:val="18"/>
+              </w:rPr>
+              <w:t>5,117（24.60%）</w:t>
+            </w:r>
+          </w:p>
+        </w:tc>
+        <w:tc>
+          <w:tcPr>
+            <w:tcW w:type="dxa" w:w="2041"/>
+          </w:tcPr>
+          <w:p>
+            <w:pPr>
+              <w:spacing w:before="20" w:after="20"/>
+              <w:jc w:val="center"/>
+            </w:pPr>
+            <w:r>
+              <w:rPr>
+                <w:rFonts w:ascii="Times New Roman" w:hAnsi="Times New Roman" w:eastAsia="宋体"/>
+                <w:sz w:val="18"/>
+              </w:rPr>
+              <w:t>4,834（11.62%）</w:t>
+            </w:r>
+          </w:p>
+        </w:tc>
+        <w:tc>
+          <w:tcPr>
+            <w:tcW w:type="dxa" w:w="2041"/>
+          </w:tcPr>
+          <w:p>
+            <w:pPr>
+              <w:spacing w:before="20" w:after="20"/>
+              <w:jc w:val="center"/>
+            </w:pPr>
+            <w:r>
+              <w:rPr>
+                <w:rFonts w:ascii="Times New Roman" w:hAnsi="Times New Roman" w:eastAsia="宋体"/>
+                <w:sz w:val="18"/>
+              </w:rPr>
+              <w:t>布局布线一次通过</w:t>
+            </w:r>
+          </w:p>
+        </w:tc>
+      </w:tr>
+      <w:tr>
+        <w:tc>
+          <w:tcPr>
+            <w:tcW w:type="dxa" w:w="2041"/>
+          </w:tcPr>
+          <w:p>
+            <w:pPr>
+              <w:spacing w:before="20" w:after="20"/>
+              <w:jc w:val="center"/>
+            </w:pPr>
+            <w:r>
+              <w:rPr>
+                <w:rFonts w:ascii="Times New Roman" w:hAnsi="Times New Roman" w:eastAsia="宋体"/>
+                <w:sz w:val="18"/>
+              </w:rPr>
+              <w:t>降幅</w:t>
+            </w:r>
+          </w:p>
+        </w:tc>
+        <w:tc>
+          <w:tcPr>
+            <w:tcW w:type="dxa" w:w="2041"/>
+          </w:tcPr>
+          <w:p>
+            <w:pPr>
+              <w:spacing w:before="20" w:after="20"/>
+              <w:jc w:val="center"/>
+            </w:pPr>
+            <w:r>
+              <w:rPr>
+                <w:rFonts w:ascii="Times New Roman" w:hAnsi="Times New Roman" w:eastAsia="宋体"/>
+                <w:sz w:val="18"/>
+              </w:rPr>
+              <w:t>−75.4%</w:t>
+            </w:r>
+          </w:p>
+        </w:tc>
+        <w:tc>
+          <w:tcPr>
+            <w:tcW w:type="dxa" w:w="2041"/>
+          </w:tcPr>
+          <w:p>
+            <w:pPr>
+              <w:spacing w:before="20" w:after="20"/>
+              <w:jc w:val="center"/>
+            </w:pPr>
+            <w:r>
+              <w:rPr>
+                <w:rFonts w:ascii="Times New Roman" w:hAnsi="Times New Roman" w:eastAsia="宋体"/>
+                <w:sz w:val="18"/>
+              </w:rPr>
+              <w:t>−86.5%</w:t>
+            </w:r>
+          </w:p>
+        </w:tc>
+        <w:tc>
+          <w:tcPr>
+            <w:tcW w:type="dxa" w:w="2041"/>
+          </w:tcPr>
+          <w:p>
+            <w:pPr>
+              <w:spacing w:before="20" w:after="20"/>
+              <w:jc w:val="center"/>
+            </w:pPr>
+            <w:r>
+              <w:rPr>
+                <w:rFonts w:ascii="Times New Roman" w:hAnsi="Times New Roman" w:eastAsia="宋体"/>
+                <w:sz w:val="18"/>
+              </w:rPr>
+              <w:t>—</w:t>
+            </w:r>
+          </w:p>
+        </w:tc>
+      </w:tr>
+      <w:tr>
+        <w:tc>
+          <w:tcPr>
+            <w:tcW w:type="dxa" w:w="2041"/>
+          </w:tcPr>
+          <w:p>
+            <w:pPr>
+              <w:spacing w:before="20" w:after="20"/>
+              <w:jc w:val="center"/>
+            </w:pPr>
+            <w:r>
+              <w:rPr>
+                <w:rFonts w:ascii="Times New Roman" w:hAnsi="Times New Roman" w:eastAsia="宋体"/>
+                <w:sz w:val="18"/>
+              </w:rPr>
+              <w:t>功能扩展后（当前交付版）</w:t>
+            </w:r>
+          </w:p>
+        </w:tc>
+        <w:tc>
+          <w:tcPr>
+            <w:tcW w:type="dxa" w:w="2041"/>
+          </w:tcPr>
+          <w:p>
+            <w:pPr>
+              <w:spacing w:before="20" w:after="20"/>
+              <w:jc w:val="center"/>
+            </w:pPr>
+            <w:r>
+              <w:rPr>
+                <w:rFonts w:ascii="Times New Roman" w:hAnsi="Times New Roman" w:eastAsia="宋体"/>
+                <w:sz w:val="18"/>
+              </w:rPr>
+              <w:t>7,063（33.96%）</w:t>
+            </w:r>
+          </w:p>
+        </w:tc>
+        <w:tc>
+          <w:tcPr>
+            <w:tcW w:type="dxa" w:w="2041"/>
+          </w:tcPr>
+          <w:p>
+            <w:pPr>
+              <w:spacing w:before="20" w:after="20"/>
+              <w:jc w:val="center"/>
+            </w:pPr>
+            <w:r>
+              <w:rPr>
+                <w:rFonts w:ascii="Times New Roman" w:hAnsi="Times New Roman" w:eastAsia="宋体"/>
+                <w:sz w:val="18"/>
+              </w:rPr>
+              <w:t>7,355（17.68%）</w:t>
+            </w:r>
+          </w:p>
+        </w:tc>
+        <w:tc>
+          <w:tcPr>
+            <w:tcW w:type="dxa" w:w="2041"/>
+          </w:tcPr>
+          <w:p>
+            <w:pPr>
+              <w:spacing w:before="20" w:after="20"/>
+              <w:jc w:val="center"/>
+            </w:pPr>
+            <w:r>
+              <w:rPr>
+                <w:rFonts w:ascii="Times New Roman" w:hAnsi="Times New Roman" w:eastAsia="宋体"/>
+                <w:sz w:val="18"/>
+              </w:rPr>
+              <w:t>已含时基/插值/谱帧/预触发</w:t>
+            </w:r>
+          </w:p>
+        </w:tc>
+      </w:tr>
+    </w:tbl>
+    <w:p>
+      <w:pPr>
+        <w:rPr>
+          <w:rFonts w:ascii="Times New Roman" w:hAnsi="Times New Roman" w:eastAsia="宋体" w:cs="Times New Roman"/>
+          <w:b/>
+          <w:sz w:val="28"/>
+        </w:rPr>
+        <w:ind w:firstLineChars="200"/>
+        <w:spacing w:line="360" w:lineRule="auto"/>
+      </w:pPr>
+      <w:r>
+        <w:rPr>
+          <w:rFonts w:ascii="Times New Roman" w:hAnsi="Times New Roman" w:eastAsia="宋体"/>
+          <w:sz w:val="24"/>
+        </w:rPr>
+        <w:t xml:space="preserve">除根因修复外，算法侧也做了主动优化：自研 1024 点 FFT 与厂商 4096 点 IP 在裸核同口径下的资源对比如下。自研核每点 LUT 为 0.49，与 IP 的 0.43 属同一量级，说明手写实现的资源效率达到商用 IP 水准；而其控制逻辑全部以可读 RTL 呈现，便于讲解与二次开发。</w:t>
+      </w:r>
+    </w:p>
+    <w:tbl>
+      <w:tblPr>
+        <w:tblW w:type="auto" w:w="0"/>
+        <w:jc w:val="center"/>
+        <w:tblLook w:firstColumn="1" w:firstRow="1" w:lastColumn="0" w:lastRow="0" w:noHBand="0" w:noVBand="1" w:val="04A0"/>
+        <w:tblBorders>
+          <w:top w:val="single" w:sz="12"/>
+          <w:bottom w:val="single" w:sz="12"/>
+          <w:left w:val="none"/>
+          <w:right w:val="none"/>
+          <w:insideH w:val="none"/>
+          <w:insideV w:val="none"/>
+        </w:tblBorders>
+        <w:tblLayout w:type="fixed"/>
+      </w:tblPr>
+      <w:tblGrid>
+        <w:gridCol w:w="2076"/>
+        <w:gridCol w:w="2076"/>
+        <w:gridCol w:w="2076"/>
+        <w:gridCol w:w="2076"/>
+      </w:tblGrid>
+      <w:tr>
+        <w:tc>
+          <w:tcPr>
+            <w:tcW w:type="dxa" w:w="2041"/>
+            <w:tcBorders>
+              <w:bottom w:val="single" w:sz="6"/>
+            </w:tcBorders>
+          </w:tcPr>
+          <w:p>
+            <w:pPr>
+              <w:spacing w:before="20" w:after="20"/>
+              <w:jc w:val="center"/>
+            </w:pPr>
+            <w:r>
+              <w:rPr>
+                <w:rFonts w:ascii="Times New Roman" w:hAnsi="Times New Roman" w:eastAsia="宋体"/>
+                <w:b/>
+                <w:sz w:val="18"/>
+              </w:rPr>
+              <w:t>指标（裸核同口径）</w:t>
+            </w:r>
+          </w:p>
+        </w:tc>
+        <w:tc>
+          <w:tcPr>
+            <w:tcW w:type="dxa" w:w="2041"/>
+            <w:tcBorders>
+              <w:bottom w:val="single" w:sz="6"/>
+            </w:tcBorders>
+          </w:tcPr>
+          <w:p>
+            <w:pPr>
+              <w:spacing w:before="20" w:after="20"/>
+              <w:jc w:val="center"/>
+            </w:pPr>
+            <w:r>
+              <w:rPr>
+                <w:rFonts w:ascii="Times New Roman" w:hAnsi="Times New Roman" w:eastAsia="宋体"/>
+                <w:b/>
+                <w:sz w:val="18"/>
+              </w:rPr>
+              <w:t>自研 self_fft_1024</w:t>
+            </w:r>
+          </w:p>
+        </w:tc>
+        <w:tc>
+          <w:tcPr>
+            <w:tcW w:type="dxa" w:w="2041"/>
+            <w:tcBorders>
+              <w:bottom w:val="single" w:sz="6"/>
+            </w:tcBorders>
+          </w:tcPr>
+          <w:p>
+            <w:pPr>
+              <w:spacing w:before="20" w:after="20"/>
+              <w:jc w:val="center"/>
+            </w:pPr>
+            <w:r>
+              <w:rPr>
+                <w:rFonts w:ascii="Times New Roman" w:hAnsi="Times New Roman" w:eastAsia="宋体"/>
+                <w:b/>
+                <w:sz w:val="18"/>
+              </w:rPr>
+              <w:t>Xilinx xfft_0（IP）</w:t>
+            </w:r>
+          </w:p>
+        </w:tc>
+        <w:tc>
+          <w:tcPr>
+            <w:tcW w:type="dxa" w:w="2041"/>
+            <w:tcBorders>
+              <w:bottom w:val="single" w:sz="6"/>
+            </w:tcBorders>
+          </w:tcPr>
+          <w:p>
+            <w:pPr>
+              <w:spacing w:before="20" w:after="20"/>
+              <w:jc w:val="center"/>
+            </w:pPr>
+            <w:r>
+              <w:rPr>
+                <w:rFonts w:ascii="Times New Roman" w:hAnsi="Times New Roman" w:eastAsia="宋体"/>
+                <w:b/>
+                <w:sz w:val="18"/>
+              </w:rPr>
+              <w:t>对比</w:t>
+            </w:r>
+          </w:p>
+        </w:tc>
+      </w:tr>
+      <w:tr>
+        <w:tc>
+          <w:tcPr>
+            <w:tcW w:type="dxa" w:w="2041"/>
+          </w:tcPr>
+          <w:p>
+            <w:pPr>
+              <w:spacing w:before="20" w:after="20"/>
+              <w:jc w:val="center"/>
+            </w:pPr>
+            <w:r>
+              <w:rPr>
+                <w:rFonts w:ascii="Times New Roman" w:hAnsi="Times New Roman" w:eastAsia="宋体"/>
+                <w:sz w:val="18"/>
+              </w:rPr>
+              <w:t>点数 N</w:t>
+            </w:r>
+          </w:p>
+        </w:tc>
+        <w:tc>
+          <w:tcPr>
+            <w:tcW w:type="dxa" w:w="2041"/>
+          </w:tcPr>
+          <w:p>
+            <w:pPr>
+              <w:spacing w:before="20" w:after="20"/>
+              <w:jc w:val="center"/>
+            </w:pPr>
+            <w:r>
+              <w:rPr>
+                <w:rFonts w:ascii="Times New Roman" w:hAnsi="Times New Roman" w:eastAsia="宋体"/>
+                <w:sz w:val="18"/>
+              </w:rPr>
+              <w:t>1024</w:t>
+            </w:r>
+          </w:p>
+        </w:tc>
+        <w:tc>
+          <w:tcPr>
+            <w:tcW w:type="dxa" w:w="2041"/>
+          </w:tcPr>
+          <w:p>
+            <w:pPr>
+              <w:spacing w:before="20" w:after="20"/>
+              <w:jc w:val="center"/>
+            </w:pPr>
+            <w:r>
+              <w:rPr>
+                <w:rFonts w:ascii="Times New Roman" w:hAnsi="Times New Roman" w:eastAsia="宋体"/>
+                <w:sz w:val="18"/>
+              </w:rPr>
+              <w:t>4096</w:t>
+            </w:r>
+          </w:p>
+        </w:tc>
+        <w:tc>
+          <w:tcPr>
+            <w:tcW w:type="dxa" w:w="2041"/>
+          </w:tcPr>
+          <w:p>
+            <w:pPr>
+              <w:spacing w:before="20" w:after="20"/>
+              <w:jc w:val="center"/>
+            </w:pPr>
+            <w:r>
+              <w:rPr>
+                <w:rFonts w:ascii="Times New Roman" w:hAnsi="Times New Roman" w:eastAsia="宋体"/>
+                <w:sz w:val="18"/>
+              </w:rPr>
+              <w:t>1/4 规模</w:t>
+            </w:r>
+          </w:p>
+        </w:tc>
+      </w:tr>
+      <w:tr>
+        <w:tc>
+          <w:tcPr>
+            <w:tcW w:type="dxa" w:w="2041"/>
+          </w:tcPr>
+          <w:p>
+            <w:pPr>
+              <w:spacing w:before="20" w:after="20"/>
+              <w:jc w:val="center"/>
+            </w:pPr>
+            <w:r>
+              <w:rPr>
+                <w:rFonts w:ascii="Times New Roman" w:hAnsi="Times New Roman" w:eastAsia="宋体"/>
+                <w:sz w:val="18"/>
+              </w:rPr>
+              <w:t>LUTs</w:t>
+            </w:r>
+          </w:p>
+        </w:tc>
+        <w:tc>
+          <w:tcPr>
+            <w:tcW w:type="dxa" w:w="2041"/>
+          </w:tcPr>
+          <w:p>
+            <w:pPr>
+              <w:spacing w:before="20" w:after="20"/>
+              <w:jc w:val="center"/>
+            </w:pPr>
+            <w:r>
+              <w:rPr>
+                <w:rFonts w:ascii="Times New Roman" w:hAnsi="Times New Roman" w:eastAsia="宋体"/>
+                <w:sz w:val="18"/>
+              </w:rPr>
+              <w:t>502</w:t>
+            </w:r>
+          </w:p>
+        </w:tc>
+        <w:tc>
+          <w:tcPr>
+            <w:tcW w:type="dxa" w:w="2041"/>
+          </w:tcPr>
+          <w:p>
+            <w:pPr>
+              <w:spacing w:before="20" w:after="20"/>
+              <w:jc w:val="center"/>
+            </w:pPr>
+            <w:r>
+              <w:rPr>
+                <w:rFonts w:ascii="Times New Roman" w:hAnsi="Times New Roman" w:eastAsia="宋体"/>
+                <w:sz w:val="18"/>
+              </w:rPr>
+              <w:t>1,771</w:t>
+            </w:r>
+          </w:p>
+        </w:tc>
+        <w:tc>
+          <w:tcPr>
+            <w:tcW w:type="dxa" w:w="2041"/>
+          </w:tcPr>
+          <w:p>
+            <w:pPr>
+              <w:spacing w:before="20" w:after="20"/>
+              <w:jc w:val="center"/>
+            </w:pPr>
+            <w:r>
+              <w:rPr>
+                <w:rFonts w:ascii="Times New Roman" w:hAnsi="Times New Roman" w:eastAsia="宋体"/>
+                <w:sz w:val="18"/>
+              </w:rPr>
+              <w:t>自研约 28%</w:t>
+            </w:r>
+          </w:p>
+        </w:tc>
+      </w:tr>
+      <w:tr>
+        <w:tc>
+          <w:tcPr>
+            <w:tcW w:type="dxa" w:w="2041"/>
+          </w:tcPr>
+          <w:p>
+            <w:pPr>
+              <w:spacing w:before="20" w:after="20"/>
+              <w:jc w:val="center"/>
+            </w:pPr>
+            <w:r>
+              <w:rPr>
+                <w:rFonts w:ascii="Times New Roman" w:hAnsi="Times New Roman" w:eastAsia="宋体"/>
+                <w:sz w:val="18"/>
+              </w:rPr>
+              <w:t>FFs</w:t>
+            </w:r>
+          </w:p>
+        </w:tc>
+        <w:tc>
+          <w:tcPr>
+            <w:tcW w:type="dxa" w:w="2041"/>
+          </w:tcPr>
+          <w:p>
+            <w:pPr>
+              <w:spacing w:before="20" w:after="20"/>
+              <w:jc w:val="center"/>
+            </w:pPr>
+            <w:r>
+              <w:rPr>
+                <w:rFonts w:ascii="Times New Roman" w:hAnsi="Times New Roman" w:eastAsia="宋体"/>
+                <w:sz w:val="18"/>
+              </w:rPr>
+              <w:t>346</w:t>
+            </w:r>
+          </w:p>
+        </w:tc>
+        <w:tc>
+          <w:tcPr>
+            <w:tcW w:type="dxa" w:w="2041"/>
+          </w:tcPr>
+          <w:p>
+            <w:pPr>
+              <w:spacing w:before="20" w:after="20"/>
+              <w:jc w:val="center"/>
+            </w:pPr>
+            <w:r>
+              <w:rPr>
+                <w:rFonts w:ascii="Times New Roman" w:hAnsi="Times New Roman" w:eastAsia="宋体"/>
+                <w:sz w:val="18"/>
+              </w:rPr>
+              <w:t>2,550</w:t>
+            </w:r>
+          </w:p>
+        </w:tc>
+        <w:tc>
+          <w:tcPr>
+            <w:tcW w:type="dxa" w:w="2041"/>
+          </w:tcPr>
+          <w:p>
+            <w:pPr>
+              <w:spacing w:before="20" w:after="20"/>
+              <w:jc w:val="center"/>
+            </w:pPr>
+            <w:r>
+              <w:rPr>
+                <w:rFonts w:ascii="Times New Roman" w:hAnsi="Times New Roman" w:eastAsia="宋体"/>
+                <w:sz w:val="18"/>
+              </w:rPr>
+              <w:t>自研约 14%</w:t>
+            </w:r>
+          </w:p>
+        </w:tc>
+      </w:tr>
+      <w:tr>
+        <w:tc>
+          <w:tcPr>
+            <w:tcW w:type="dxa" w:w="2041"/>
+          </w:tcPr>
+          <w:p>
+            <w:pPr>
+              <w:spacing w:before="20" w:after="20"/>
+              <w:jc w:val="center"/>
+            </w:pPr>
+            <w:r>
+              <w:rPr>
+                <w:rFonts w:ascii="Times New Roman" w:hAnsi="Times New Roman" w:eastAsia="宋体"/>
+                <w:sz w:val="18"/>
+              </w:rPr>
+              <w:t>DSP</w:t>
+            </w:r>
+          </w:p>
+        </w:tc>
+        <w:tc>
+          <w:tcPr>
+            <w:tcW w:type="dxa" w:w="2041"/>
+          </w:tcPr>
+          <w:p>
+            <w:pPr>
+              <w:spacing w:before="20" w:after="20"/>
+              <w:jc w:val="center"/>
+            </w:pPr>
+            <w:r>
+              <w:rPr>
+                <w:rFonts w:ascii="Times New Roman" w:hAnsi="Times New Roman" w:eastAsia="宋体"/>
+                <w:sz w:val="18"/>
+              </w:rPr>
+              <w:t>7</w:t>
+            </w:r>
+          </w:p>
+        </w:tc>
+        <w:tc>
+          <w:tcPr>
+            <w:tcW w:type="dxa" w:w="2041"/>
+          </w:tcPr>
+          <w:p>
+            <w:pPr>
+              <w:spacing w:before="20" w:after="20"/>
+              <w:jc w:val="center"/>
+            </w:pPr>
+            <w:r>
+              <w:rPr>
+                <w:rFonts w:ascii="Times New Roman" w:hAnsi="Times New Roman" w:eastAsia="宋体"/>
+                <w:sz w:val="18"/>
+              </w:rPr>
+              <w:t>9</w:t>
+            </w:r>
+          </w:p>
+        </w:tc>
+        <w:tc>
+          <w:tcPr>
+            <w:tcW w:type="dxa" w:w="2041"/>
+          </w:tcPr>
+          <w:p>
+            <w:pPr>
+              <w:spacing w:before="20" w:after="20"/>
+              <w:jc w:val="center"/>
+            </w:pPr>
+            <w:r>
+              <w:rPr>
+                <w:rFonts w:ascii="Times New Roman" w:hAnsi="Times New Roman" w:eastAsia="宋体"/>
+                <w:sz w:val="18"/>
+              </w:rPr>
+              <w:t>相当</w:t>
+            </w:r>
+          </w:p>
+        </w:tc>
+      </w:tr>
+      <w:tr>
+        <w:tc>
+          <w:tcPr>
+            <w:tcW w:type="dxa" w:w="2041"/>
+          </w:tcPr>
+          <w:p>
+            <w:pPr>
+              <w:spacing w:before="20" w:after="20"/>
+              <w:jc w:val="center"/>
+            </w:pPr>
+            <w:r>
+              <w:rPr>
+                <w:rFonts w:ascii="Times New Roman" w:hAnsi="Times New Roman" w:eastAsia="宋体"/>
+                <w:sz w:val="18"/>
+              </w:rPr>
+              <w:t>每点 LUT</w:t>
+            </w:r>
+          </w:p>
+        </w:tc>
+        <w:tc>
+          <w:tcPr>
+            <w:tcW w:type="dxa" w:w="2041"/>
+          </w:tcPr>
+          <w:p>
+            <w:pPr>
+              <w:spacing w:before="20" w:after="20"/>
+              <w:jc w:val="center"/>
+            </w:pPr>
+            <w:r>
+              <w:rPr>
+                <w:rFonts w:ascii="Times New Roman" w:hAnsi="Times New Roman" w:eastAsia="宋体"/>
+                <w:sz w:val="18"/>
+              </w:rPr>
+              <w:t>0.49</w:t>
+            </w:r>
+          </w:p>
+        </w:tc>
+        <w:tc>
+          <w:tcPr>
+            <w:tcW w:type="dxa" w:w="2041"/>
+          </w:tcPr>
+          <w:p>
+            <w:pPr>
+              <w:spacing w:before="20" w:after="20"/>
+              <w:jc w:val="center"/>
+            </w:pPr>
+            <w:r>
+              <w:rPr>
+                <w:rFonts w:ascii="Times New Roman" w:hAnsi="Times New Roman" w:eastAsia="宋体"/>
+                <w:sz w:val="18"/>
+              </w:rPr>
+              <w:t>0.43</w:t>
+            </w:r>
+          </w:p>
+        </w:tc>
+        <w:tc>
+          <w:tcPr>
+            <w:tcW w:type="dxa" w:w="2041"/>
+          </w:tcPr>
+          <w:p>
+            <w:pPr>
+              <w:spacing w:before="20" w:after="20"/>
+              <w:jc w:val="center"/>
+            </w:pPr>
+            <w:r>
+              <w:rPr>
+                <w:rFonts w:ascii="Times New Roman" w:hAnsi="Times New Roman" w:eastAsia="宋体"/>
+                <w:sz w:val="18"/>
+              </w:rPr>
+              <w:t>同量级，手写质量达标</w:t>
+            </w:r>
+          </w:p>
+        </w:tc>
+      </w:tr>
+      <w:tr>
+        <w:tc>
+          <w:tcPr>
+            <w:tcW w:type="dxa" w:w="2041"/>
+          </w:tcPr>
+          <w:p>
+            <w:pPr>
+              <w:spacing w:before="20" w:after="20"/>
+              <w:jc w:val="center"/>
+            </w:pPr>
+            <w:r>
+              <w:rPr>
+                <w:rFonts w:ascii="Times New Roman" w:hAnsi="Times New Roman" w:eastAsia="宋体"/>
+                <w:sz w:val="18"/>
+              </w:rPr>
+              <w:t>频率分辨率（fs=50kHz）</w:t>
+            </w:r>
+          </w:p>
+        </w:tc>
+        <w:tc>
+          <w:tcPr>
+            <w:tcW w:type="dxa" w:w="2041"/>
+          </w:tcPr>
+          <w:p>
+            <w:pPr>
+              <w:spacing w:before="20" w:after="20"/>
+              <w:jc w:val="center"/>
+            </w:pPr>
+            <w:r>
+              <w:rPr>
+                <w:rFonts w:ascii="Times New Roman" w:hAnsi="Times New Roman" w:eastAsia="宋体"/>
+                <w:sz w:val="18"/>
+              </w:rPr>
+              <w:t>48.8 Hz</w:t>
+            </w:r>
+          </w:p>
+        </w:tc>
+        <w:tc>
+          <w:tcPr>
+            <w:tcW w:type="dxa" w:w="2041"/>
+          </w:tcPr>
+          <w:p>
+            <w:pPr>
+              <w:spacing w:before="20" w:after="20"/>
+              <w:jc w:val="center"/>
+            </w:pPr>
+            <w:r>
+              <w:rPr>
+                <w:rFonts w:ascii="Times New Roman" w:hAnsi="Times New Roman" w:eastAsia="宋体"/>
+                <w:sz w:val="18"/>
+              </w:rPr>
+              <w:t>12.2 Hz</w:t>
+            </w:r>
+          </w:p>
+        </w:tc>
+        <w:tc>
+          <w:tcPr>
+            <w:tcW w:type="dxa" w:w="2041"/>
+          </w:tcPr>
+          <w:p>
+            <w:pPr>
+              <w:spacing w:before="20" w:after="20"/>
+              <w:jc w:val="center"/>
+            </w:pPr>
+            <w:r>
+              <w:rPr>
+                <w:rFonts w:ascii="Times New Roman" w:hAnsi="Times New Roman" w:eastAsia="宋体"/>
+                <w:sz w:val="18"/>
+              </w:rPr>
+              <w:t>与点数成比例</w:t>
+            </w:r>
+          </w:p>
+        </w:tc>
+      </w:tr>
+      <w:tr>
+        <w:tc>
+          <w:tcPr>
+            <w:tcW w:type="dxa" w:w="2041"/>
+          </w:tcPr>
+          <w:p>
+            <w:pPr>
+              <w:spacing w:before="20" w:after="20"/>
+              <w:jc w:val="center"/>
+            </w:pPr>
+            <w:r>
+              <w:rPr>
+                <w:rFonts w:ascii="Times New Roman" w:hAnsi="Times New Roman" w:eastAsia="宋体"/>
+                <w:sz w:val="18"/>
+              </w:rPr>
+              <w:t>算法</w:t>
+            </w:r>
+          </w:p>
+        </w:tc>
+        <w:tc>
+          <w:tcPr>
+            <w:tcW w:type="dxa" w:w="2041"/>
+          </w:tcPr>
+          <w:p>
+            <w:pPr>
+              <w:spacing w:before="20" w:after="20"/>
+              <w:jc w:val="center"/>
+            </w:pPr>
+            <w:r>
+              <w:rPr>
+                <w:rFonts w:ascii="Times New Roman" w:hAnsi="Times New Roman" w:eastAsia="宋体"/>
+                <w:sz w:val="18"/>
+              </w:rPr>
+              <w:t>Radix-2 DIF 原地（自研 RTL）</w:t>
+            </w:r>
+          </w:p>
+        </w:tc>
+        <w:tc>
+          <w:tcPr>
+            <w:tcW w:type="dxa" w:w="2041"/>
+          </w:tcPr>
+          <w:p>
+            <w:pPr>
+              <w:spacing w:before="20" w:after="20"/>
+              <w:jc w:val="center"/>
+            </w:pPr>
+            <w:r>
+              <w:rPr>
+                <w:rFonts w:ascii="Times New Roman" w:hAnsi="Times New Roman" w:eastAsia="宋体"/>
+                <w:sz w:val="18"/>
+              </w:rPr>
+              <w:t>Radix-4 Burst / BFP</w:t>
+            </w:r>
+          </w:p>
+        </w:tc>
+        <w:tc>
+          <w:tcPr>
+            <w:tcW w:type="dxa" w:w="2041"/>
+          </w:tcPr>
+          <w:p>
+            <w:pPr>
+              <w:spacing w:before="20" w:after="20"/>
+              <w:jc w:val="center"/>
+            </w:pPr>
+            <w:r>
+              <w:rPr>
+                <w:rFonts w:ascii="Times New Roman" w:hAnsi="Times New Roman" w:eastAsia="宋体"/>
+                <w:sz w:val="18"/>
+              </w:rPr>
+              <w:t>架构不同</w:t>
+            </w:r>
+          </w:p>
+        </w:tc>
+      </w:tr>
+    </w:tbl>
     <w:p>
       <w:pPr>
         <w:spacing w:line="360" w:lineRule="auto"/>

</xml_diff>

<commit_message>
Tech doc: add three figures (system block diagram, resource chart, pretrigger tiers)
The document had no content figures at all, while the official template
asks for 'text with figures' and a photo-led third section.

- Extends the builder with an IMG block type (centred picture + caption).
- Adds report/figures/ with three generated diagrams:
  fig_system_block.png      - module-level block diagram of the FPGA design
  fig_resource_before_after.png - LUT 20,829 -> 5,117 -> 7,063 vs the 20,800 limit
  fig_pretrigger_tiers.png  - trigger position at 0/256/512/768 across the frame
- Inserts them at 2.1, 2.4 and the end of section 3.
- Document grows from 11 to 14 pages.
</commit_message>
<xml_diff>
--- a/report/tech_doc_draft.docx
+++ b/report/tech_doc_draft.docx
@@ -1757,6 +1757,63 @@
     </w:p>
     <w:p>
       <w:pPr>
+        <w:jc w:val="center"/>
+      </w:pPr>
+      <w:r>
+        <w:drawing>
+          <wp:inline xmlns:a="http://schemas.openxmlformats.org/drawingml/2006/main" xmlns:pic="http://schemas.openxmlformats.org/drawingml/2006/picture">
+            <wp:extent cx="5580000" cy="3050400"/>
+            <wp:docPr id="1" name="Picture 1"/>
+            <wp:cNvGraphicFramePr>
+              <a:graphicFrameLocks noChangeAspect="1"/>
+            </wp:cNvGraphicFramePr>
+            <a:graphic>
+              <a:graphicData uri="http://schemas.openxmlformats.org/drawingml/2006/picture">
+                <pic:pic>
+                  <pic:nvPicPr>
+                    <pic:cNvPr id="0" name="fig_system_block.png"/>
+                    <pic:cNvPicPr/>
+                  </pic:nvPicPr>
+                  <pic:blipFill>
+                    <a:blip r:embed="rId12"/>
+                    <a:stretch>
+                      <a:fillRect/>
+                    </a:stretch>
+                  </pic:blipFill>
+                  <pic:spPr>
+                    <a:xfrm>
+                      <a:off x="0" y="0"/>
+                      <a:ext cx="5580000" cy="3050400"/>
+                    </a:xfrm>
+                    <a:prstGeom prst="rect"/>
+                  </pic:spPr>
+                </pic:pic>
+              </a:graphicData>
+            </a:graphic>
+          </wp:inline>
+        </w:drawing>
+      </w:r>
+    </w:p>
+    <w:p>
+      <w:pPr>
+        <w:rPr>
+          <w:rFonts w:ascii="Times New Roman" w:hAnsi="Times New Roman" w:eastAsia="宋体" w:cs="Times New Roman"/>
+          <w:b/>
+          <w:sz w:val="28"/>
+        </w:rPr>
+        <w:jc w:val="center"/>
+        <w:spacing w:line="360" w:lineRule="auto" w:after="80"/>
+      </w:pPr>
+      <w:r>
+        <w:rPr>
+          <w:rFonts w:ascii="Times New Roman" w:hAnsi="Times New Roman" w:eastAsia="宋体"/>
+          <w:sz w:val="18"/>
+        </w:rPr>
+        <w:t xml:space="preserve">图 1  系统整体框图（FPGA 内部模块划分与板内闭环自测通路）</w:t>
+      </w:r>
+    </w:p>
+    <w:p>
+      <w:pPr>
         <w:rPr>
           <w:rFonts w:ascii="Times New Roman" w:hAnsi="Times New Roman" w:eastAsia="宋体" w:cs="Times New Roman"/>
           <w:b/>
@@ -2461,6 +2518,63 @@
     </w:tbl>
     <w:p>
       <w:pPr>
+        <w:jc w:val="center"/>
+      </w:pPr>
+      <w:r>
+        <w:drawing>
+          <wp:inline xmlns:a="http://schemas.openxmlformats.org/drawingml/2006/main" xmlns:pic="http://schemas.openxmlformats.org/drawingml/2006/picture">
+            <wp:extent cx="4860000" cy="2527200"/>
+            <wp:docPr id="2" name="Picture 2"/>
+            <wp:cNvGraphicFramePr>
+              <a:graphicFrameLocks noChangeAspect="1"/>
+            </wp:cNvGraphicFramePr>
+            <a:graphic>
+              <a:graphicData uri="http://schemas.openxmlformats.org/drawingml/2006/picture">
+                <pic:pic>
+                  <pic:nvPicPr>
+                    <pic:cNvPr id="0" name="fig_resource_before_after.png"/>
+                    <pic:cNvPicPr/>
+                  </pic:nvPicPr>
+                  <pic:blipFill>
+                    <a:blip r:embed="rId13"/>
+                    <a:stretch>
+                      <a:fillRect/>
+                    </a:stretch>
+                  </pic:blipFill>
+                  <pic:spPr>
+                    <a:xfrm>
+                      <a:off x="0" y="0"/>
+                      <a:ext cx="4860000" cy="2527200"/>
+                    </a:xfrm>
+                    <a:prstGeom prst="rect"/>
+                  </pic:spPr>
+                </pic:pic>
+              </a:graphicData>
+            </a:graphic>
+          </wp:inline>
+        </w:drawing>
+      </w:r>
+    </w:p>
+    <w:p>
+      <w:pPr>
+        <w:rPr>
+          <w:rFonts w:ascii="Times New Roman" w:hAnsi="Times New Roman" w:eastAsia="宋体" w:cs="Times New Roman"/>
+          <w:b/>
+          <w:sz w:val="28"/>
+        </w:rPr>
+        <w:jc w:val="center"/>
+        <w:spacing w:line="360" w:lineRule="auto" w:after="80"/>
+      </w:pPr>
+      <w:r>
+        <w:rPr>
+          <w:rFonts w:ascii="Times New Roman" w:hAnsi="Times New Roman" w:eastAsia="宋体"/>
+          <w:sz w:val="18"/>
+        </w:rPr>
+        <w:t xml:space="preserve">图 2  资源优化前后对比（整改前超容 29 个，整改后降至 24.60%）</w:t>
+      </w:r>
+    </w:p>
+    <w:p>
+      <w:pPr>
         <w:rPr>
           <w:rFonts w:ascii="Times New Roman" w:hAnsi="Times New Roman" w:eastAsia="宋体" w:cs="Times New Roman"/>
           <w:b/>
@@ -3806,6 +3920,63 @@
           <w:sz w:val="24"/>
         </w:rPr>
         <w:t xml:space="preserve">【图 3-8 位置：模拟链路频响实测曲线（P8）】</w:t>
+      </w:r>
+    </w:p>
+    <w:p>
+      <w:pPr>
+        <w:jc w:val="center"/>
+      </w:pPr>
+      <w:r>
+        <w:drawing>
+          <wp:inline xmlns:a="http://schemas.openxmlformats.org/drawingml/2006/main" xmlns:pic="http://schemas.openxmlformats.org/drawingml/2006/picture">
+            <wp:extent cx="5220000" cy="4081091"/>
+            <wp:docPr id="3" name="Picture 3"/>
+            <wp:cNvGraphicFramePr>
+              <a:graphicFrameLocks noChangeAspect="1"/>
+            </wp:cNvGraphicFramePr>
+            <a:graphic>
+              <a:graphicData uri="http://schemas.openxmlformats.org/drawingml/2006/picture">
+                <pic:pic>
+                  <pic:nvPicPr>
+                    <pic:cNvPr id="0" name="fig_pretrigger_tiers.png"/>
+                    <pic:cNvPicPr/>
+                  </pic:nvPicPr>
+                  <pic:blipFill>
+                    <a:blip r:embed="rId14"/>
+                    <a:stretch>
+                      <a:fillRect/>
+                    </a:stretch>
+                  </pic:blipFill>
+                  <pic:spPr>
+                    <a:xfrm>
+                      <a:off x="0" y="0"/>
+                      <a:ext cx="5220000" cy="4081091"/>
+                    </a:xfrm>
+                    <a:prstGeom prst="rect"/>
+                  </pic:spPr>
+                </pic:pic>
+              </a:graphicData>
+            </a:graphic>
+          </wp:inline>
+        </w:drawing>
+      </w:r>
+    </w:p>
+    <w:p>
+      <w:pPr>
+        <w:rPr>
+          <w:rFonts w:ascii="Times New Roman" w:hAnsi="Times New Roman" w:eastAsia="宋体" w:cs="Times New Roman"/>
+          <w:b/>
+          <w:sz w:val="28"/>
+        </w:rPr>
+        <w:jc w:val="center"/>
+        <w:spacing w:line="360" w:lineRule="auto" w:after="80"/>
+      </w:pPr>
+      <w:r>
+        <w:rPr>
+          <w:rFonts w:ascii="Times New Roman" w:hAnsi="Times New Roman" w:eastAsia="宋体"/>
+          <w:sz w:val="18"/>
+        </w:rPr>
+        <w:t xml:space="preserve">图 3  预触发四档：触发点落在数据帧中的位置（实测低电平点数 0 / 256 / 512 / 768）</w:t>
       </w:r>
     </w:p>
     <w:p>

</xml_diff>

<commit_message>
Add reproducible figure generator for the three tech-doc diagrams
</commit_message>
<xml_diff>
--- a/report/tech_doc_draft.docx
+++ b/report/tech_doc_draft.docx
@@ -1762,7 +1762,7 @@
       <w:r>
         <w:drawing>
           <wp:inline xmlns:a="http://schemas.openxmlformats.org/drawingml/2006/main" xmlns:pic="http://schemas.openxmlformats.org/drawingml/2006/picture">
-            <wp:extent cx="5580000" cy="3050400"/>
+            <wp:extent cx="5184000" cy="2833920"/>
             <wp:docPr id="1" name="Picture 1"/>
             <wp:cNvGraphicFramePr>
               <a:graphicFrameLocks noChangeAspect="1"/>
@@ -1783,7 +1783,7 @@
                   <pic:spPr>
                     <a:xfrm>
                       <a:off x="0" y="0"/>
-                      <a:ext cx="5580000" cy="3050400"/>
+                      <a:ext cx="5184000" cy="2833920"/>
                     </a:xfrm>
                     <a:prstGeom prst="rect"/>
                   </pic:spPr>
@@ -2523,7 +2523,7 @@
       <w:r>
         <w:drawing>
           <wp:inline xmlns:a="http://schemas.openxmlformats.org/drawingml/2006/main" xmlns:pic="http://schemas.openxmlformats.org/drawingml/2006/picture">
-            <wp:extent cx="4860000" cy="2527200"/>
+            <wp:extent cx="4896000" cy="2545920"/>
             <wp:docPr id="2" name="Picture 2"/>
             <wp:cNvGraphicFramePr>
               <a:graphicFrameLocks noChangeAspect="1"/>
@@ -2544,7 +2544,7 @@
                   <pic:spPr>
                     <a:xfrm>
                       <a:off x="0" y="0"/>
-                      <a:ext cx="4860000" cy="2527200"/>
+                      <a:ext cx="4896000" cy="2545920"/>
                     </a:xfrm>
                     <a:prstGeom prst="rect"/>
                   </pic:spPr>
@@ -3929,7 +3929,7 @@
       <w:r>
         <w:drawing>
           <wp:inline xmlns:a="http://schemas.openxmlformats.org/drawingml/2006/main" xmlns:pic="http://schemas.openxmlformats.org/drawingml/2006/picture">
-            <wp:extent cx="5220000" cy="4081091"/>
+            <wp:extent cx="5184000" cy="4052945"/>
             <wp:docPr id="3" name="Picture 3"/>
             <wp:cNvGraphicFramePr>
               <a:graphicFrameLocks noChangeAspect="1"/>
@@ -3950,7 +3950,7 @@
                   <pic:spPr>
                     <a:xfrm>
                       <a:off x="0" y="0"/>
-                      <a:ext cx="5220000" cy="4081091"/>
+                      <a:ext cx="5184000" cy="4052945"/>
                     </a:xfrm>
                     <a:prstGeom prst="rect"/>
                   </pic:spPr>

</xml_diff>

<commit_message>
Carry the new resource figures through every document
The adaptive decimation changed the numbers again: 7480 LUT, 36.00%, WNS +1.128.
Updated in the README, the technical document, the defence script, the cue card and
the submission checklist.

Timing table needed care. The 1.128 belongs to a new step six, not to the earlier
state-width fix, which measured 1.215 at the time and must keep that value or the
progression stops adding up. Same for the before/after table, whose columns now read
first implementation against current.

Added the waveform identification result to the technical document: the ceiling was
5kHz in the text and is 25kHz measured, and the reasoning behind the fix belongs in
the paper rather than only in the report.

Card gains one line for it, since it is a number the defence will want to quote.
</commit_message>
<xml_diff>
--- a/report/tech_doc_draft.docx
+++ b/report/tech_doc_draft.docx
@@ -176,15 +176,15 @@
           <w:rFonts w:ascii="Times New Roman" w:hAnsi="Times New Roman" w:eastAsia="宋体"/>
           <w:sz w:val="24"/>
         </w:rPr>
-        <w:t xml:space="preserve">实测：加 Hann 窗与抛物线插值后，泄漏由 14.7% 降至 0.9%，1kHz 读数由 976Hz 修正至 999Hz（2.4%→0.1%）；电压测量 1~4V 内最大偏差 2.8%；整片 LUT 7397（35.56%）、DSP 42.22%，50MHz 下 </w:t>
-      </w:r>
-      <w:r>
-        <w:rPr>
-          <w:rFonts w:ascii="Times New Roman" w:hAnsi="Times New Roman" w:eastAsia="宋体"/>
-          <w:sz w:val="24"/>
-          <w:b/>
-        </w:rPr>
-        <w:t xml:space="preserve">WNS +1.215 ns、零失败端点</w:t>
+        <w:t xml:space="preserve">实测：加 Hann 窗与抛物线插值后，泄漏由 14.7% 降至 0.9%，1kHz 读数由 976Hz 修正至 999Hz（2.4%→0.1%）；电压测量 1~4V 内最大偏差 2.8%；整片 LUT 7480（36.00%）、DSP 42.22%，50MHz 下 </w:t>
+      </w:r>
+      <w:r>
+        <w:rPr>
+          <w:rFonts w:ascii="Times New Roman" w:hAnsi="Times New Roman" w:eastAsia="宋体"/>
+          <w:sz w:val="24"/>
+          <w:b/>
+        </w:rPr>
+        <w:t xml:space="preserve">WNS +1.128 ns、零失败端点</w:t>
       </w:r>
       <w:r>
         <w:rPr>
@@ -918,7 +918,7 @@
           <w:rFonts w:ascii="Times New Roman" w:hAnsi="Times New Roman" w:eastAsia="宋体"/>
           <w:sz w:val="24"/>
         </w:rPr>
-        <w:t xml:space="preserve">（3）轻量化的实现约束。所有扩展功能都在既有引擎上完成，不新建独立引擎：反向变换复用同一套蝶形（仅加位反转寻址与共轭旋转因子），额外逻辑代价几乎为零；50% 帧重叠用几百个 LUT 的分布式 RAM 换取采集时间减半，不占块 RAM；窗函数切换只多用一块 1024x16 的 BRAM。十项功能全部加入后，设计为 LUT 35.56%、寄存器 15.69%、DSP 42.22%、块 RAM 22.00%，LUT 仍留有约六成余量，时序裕量 +1.215ns。</w:t>
+        <w:t xml:space="preserve">（3）轻量化的实现约束。所有扩展功能都在既有引擎上完成，不新建独立引擎：反向变换复用同一套蝶形（仅加位反转寻址与共轭旋转因子），额外逻辑代价几乎为零；50% 帧重叠用几百个 LUT 的分布式 RAM 换取采集时间减半，不占块 RAM；窗函数切换只多用一块 1024x16 的 BRAM。十项功能全部加入后，设计为 LUT 36.00%、寄存器 15.69%、DSP 42.22%、块 RAM 22.00%，LUT 仍留有约六成余量，时序裕量 +1.128ns。</w:t>
       </w:r>
     </w:p>
     <w:p>
@@ -1540,7 +1540,7 @@
                 <w:rFonts w:ascii="Times New Roman" w:hAnsi="Times New Roman" w:eastAsia="宋体"/>
                 <w:sz w:val="18"/>
               </w:rPr>
-              <w:t>LUT 35.56% / FF 15.69% / DSP 42.22% / BRAM 22.00%</w:t>
+              <w:t>LUT 36.00% / FF 15.69% / DSP 42.22% / BRAM 22.00%</w:t>
             </w:r>
           </w:p>
         </w:tc>
@@ -1576,7 +1576,7 @@
                 <w:rFonts w:ascii="Times New Roman" w:hAnsi="Times New Roman" w:eastAsia="宋体"/>
                 <w:sz w:val="18"/>
               </w:rPr>
-              <w:t>WNS +1.215ns，0 失败端点</w:t>
+              <w:t>WNS +1.128ns，0 失败端点</w:t>
             </w:r>
           </w:p>
         </w:tc>
@@ -1817,7 +1817,7 @@
           <w:sz w:val="24"/>
           <w:b/>
         </w:rPr>
-        <w:t xml:space="preserve">+1.215ns</w:t>
+        <w:t xml:space="preserve">+1.128ns</w:t>
       </w:r>
       <w:r>
         <w:rPr>
@@ -2525,25 +2525,25 @@
                 <w:rFonts w:ascii="Times New Roman" w:hAnsi="Times New Roman" w:eastAsia="宋体"/>
                 <w:sz w:val="18"/>
               </w:rPr>
-              <w:t>7,397 LUT（35.56%）/ 6,527 FF（15.69%）</w:t>
-            </w:r>
-          </w:p>
-        </w:tc>
-        <w:tc>
-          <w:tcPr>
-            <w:tcW w:type="dxa" w:w="2041"/>
-          </w:tcPr>
-          <w:p>
-            <w:pPr>
-              <w:spacing w:before="20" w:after="20"/>
-              <w:jc w:val="center"/>
-            </w:pPr>
-            <w:r>
-              <w:rPr>
-                <w:rFonts w:ascii="Times New Roman" w:hAnsi="Times New Roman" w:eastAsia="宋体"/>
-                <w:sz w:val="18"/>
-              </w:rPr>
-              <w:t>时序 +1.215ns，零失败端点</w:t>
+              <w:t>7,480 LUT（36.00%）/ 6,527 FF（15.69%）</w:t>
+            </w:r>
+          </w:p>
+        </w:tc>
+        <w:tc>
+          <w:tcPr>
+            <w:tcW w:type="dxa" w:w="2041"/>
+          </w:tcPr>
+          <w:p>
+            <w:pPr>
+              <w:spacing w:before="20" w:after="20"/>
+              <w:jc w:val="center"/>
+            </w:pPr>
+            <w:r>
+              <w:rPr>
+                <w:rFonts w:ascii="Times New Roman" w:hAnsi="Times New Roman" w:eastAsia="宋体"/>
+                <w:sz w:val="18"/>
+              </w:rPr>
+              <w:t>时序 +1.128ns，零失败端点</w:t>
             </w:r>
           </w:p>
         </w:tc>
@@ -2599,7 +2599,7 @@
                 <w:rFonts w:ascii="Times New Roman" w:hAnsi="Times New Roman" w:eastAsia="宋体"/>
                 <w:sz w:val="18"/>
               </w:rPr>
-              <w:t>加四项扩展后：8,754（42.09%）；关 ILA 后最终：7,397（35.56%）</w:t>
+              <w:t>加四项扩展后：8,754（42.09%）；关 ILA 后最终：7,480（36.00%）</w:t>
             </w:r>
           </w:p>
         </w:tc>
@@ -2683,7 +2683,7 @@
           <w:rFonts w:ascii="Times New Roman" w:hAnsi="Times New Roman" w:eastAsia="宋体"/>
           <w:sz w:val="24"/>
         </w:rPr>
-        <w:t xml:space="preserve">：v1.21 交付版为 7063 LUT（33.96%），加入四项扩展后为 8754（42.09%），但当时 ILA 调试核还开着；关闭 ILA 后最终为 7397（35.56%）。</w:t>
+        <w:t xml:space="preserve">：v1.21 交付版为 7063 LUT（33.96%），加入四项扩展后为 8754（42.09%），但当时 ILA 调试核还开着；关闭 ILA 后最终为 7480（36.00%）。</w:t>
       </w:r>
       <w:r>
         <w:rPr>
@@ -3248,6 +3248,83 @@
           <w:sz w:val="24"/>
         </w:rPr>
         <w:t xml:space="preserve">，单独加窗或单独插值都达不到这个结果。</w:t>
+      </w:r>
+    </w:p>
+    <w:p>
+      <w:pPr>
+        <w:rPr>
+          <w:rFonts w:ascii="Times New Roman" w:hAnsi="Times New Roman" w:eastAsia="宋体" w:cs="Times New Roman"/>
+          <w:b/>
+          <w:sz w:val="28"/>
+        </w:rPr>
+        <w:ind w:firstLineChars="200"/>
+        <w:spacing w:line="360" w:lineRule="auto"/>
+      </w:pPr>
+      <w:r>
+        <w:rPr>
+          <w:rFonts w:ascii="Times New Roman" w:hAnsi="Times New Roman" w:eastAsia="宋体"/>
+          <w:sz w:val="24"/>
+          <w:b/>
+        </w:rPr>
+        <w:t xml:space="preserve">从“看着准”到“量出来准”</w:t>
+      </w:r>
+      <w:r>
+        <w:rPr>
+          <w:rFonts w:ascii="Times New Roman" w:hAnsi="Times New Roman" w:eastAsia="宋体"/>
+          <w:sz w:val="24"/>
+        </w:rPr>
+        <w:t xml:space="preserve">：最初波形识别沿用 50kHz 固定降采样，实测发现正弦与三角在 5kHz 就开始失败，8kHz 时正弦被误判成三角，而对外声明写的是 25kHz —— 差了近一个数量级。</w:t>
+      </w:r>
+    </w:p>
+    <w:p>
+      <w:pPr>
+        <w:rPr>
+          <w:rFonts w:ascii="Times New Roman" w:hAnsi="Times New Roman" w:eastAsia="宋体" w:cs="Times New Roman"/>
+          <w:b/>
+          <w:sz w:val="28"/>
+        </w:rPr>
+        <w:ind w:firstLineChars="200"/>
+        <w:spacing w:line="360" w:lineRule="auto"/>
+      </w:pPr>
+      <w:r>
+        <w:rPr>
+          <w:rFonts w:ascii="Times New Roman" w:hAnsi="Times New Roman" w:eastAsia="宋体"/>
+          <w:sz w:val="24"/>
+        </w:rPr>
+        <w:t xml:space="preserve">原因不是阈值调得不好，而是</w:t>
+      </w:r>
+      <w:r>
+        <w:rPr>
+          <w:rFonts w:ascii="Times New Roman" w:hAnsi="Times New Roman" w:eastAsia="宋体"/>
+          <w:sz w:val="24"/>
+          <w:b/>
+        </w:rPr>
+        <w:t xml:space="preserve">每周期样点数不足</w:t>
+      </w:r>
+      <w:r>
+        <w:rPr>
+          <w:rFonts w:ascii="Times New Roman" w:hAnsi="Times New Roman" w:eastAsia="宋体"/>
+          <w:sz w:val="24"/>
+        </w:rPr>
+        <w:t xml:space="preserve">：固定 50kHz 采样时 spp = 50000/F，降到 8 时正弦与三角的判据值区间完全重合（都是 0.25~0.50），两种波形采样下来在统计意义上无法区分。</w:t>
+      </w:r>
+    </w:p>
+    <w:p>
+      <w:pPr>
+        <w:rPr>
+          <w:rFonts w:ascii="Times New Roman" w:hAnsi="Times New Roman" w:eastAsia="宋体" w:cs="Times New Roman"/>
+          <w:b/>
+          <w:sz w:val="28"/>
+        </w:rPr>
+        <w:ind w:firstLineChars="200"/>
+        <w:spacing w:line="360" w:lineRule="auto"/>
+      </w:pPr>
+      <w:r>
+        <w:rPr>
+          <w:rFonts w:ascii="Times New Roman" w:hAnsi="Times New Roman" w:eastAsia="宋体"/>
+          <w:sz w:val="24"/>
+        </w:rPr>
+        <w:t xml:space="preserve">改法是让抽取比随实测频率变化，保持 spp ≥ 64。上板复验：1k~25kHz 三档全对且可重复。过程中还发现一个反直觉现象 —— 把采样率再提高反而更差，说明此时限制来自板上 DDS 台阶输出的信号质量，而不是统计方法本身。</w:t>
       </w:r>
     </w:p>
     <w:p>
@@ -4379,7 +4456,7 @@
                 <w:b/>
                 <w:sz w:val="18"/>
               </w:rPr>
-              <w:t>本次修改前</w:t>
+              <w:t>首版实现</w:t>
             </w:r>
           </w:p>
         </w:tc>
@@ -4401,7 +4478,7 @@
                 <w:b/>
                 <w:sz w:val="18"/>
               </w:rPr>
-              <w:t>本次修改后</w:t>
+              <w:t>当前实现</w:t>
             </w:r>
           </w:p>
         </w:tc>
@@ -4553,25 +4630,25 @@
                 <w:rFonts w:ascii="Times New Roman" w:hAnsi="Times New Roman" w:eastAsia="宋体"/>
                 <w:sz w:val="18"/>
               </w:rPr>
-              <w:t>7,397</w:t>
-            </w:r>
-          </w:p>
-        </w:tc>
-        <w:tc>
-          <w:tcPr>
-            <w:tcW w:type="dxa" w:w="2041"/>
-          </w:tcPr>
-          <w:p>
-            <w:pPr>
-              <w:spacing w:before="20" w:after="20"/>
-              <w:jc w:val="center"/>
-            </w:pPr>
-            <w:r>
-              <w:rPr>
-                <w:rFonts w:ascii="Times New Roman" w:hAnsi="Times New Roman" w:eastAsia="宋体"/>
-                <w:sz w:val="18"/>
-              </w:rPr>
-              <w:t>+39，新增状态位与清零</w:t>
+              <w:t>7,480</w:t>
+            </w:r>
+          </w:p>
+        </w:tc>
+        <w:tc>
+          <w:tcPr>
+            <w:tcW w:type="dxa" w:w="2041"/>
+          </w:tcPr>
+          <w:p>
+            <w:pPr>
+              <w:spacing w:before="20" w:after="20"/>
+              <w:jc w:val="center"/>
+            </w:pPr>
+            <w:r>
+              <w:rPr>
+                <w:rFonts w:ascii="Times New Roman" w:hAnsi="Times New Roman" w:eastAsia="宋体"/>
+                <w:sz w:val="18"/>
+              </w:rPr>
+              <w:t>+122，新增状态位/清零/抽取选择</w:t>
             </w:r>
           </w:p>
         </w:tc>
@@ -4627,25 +4704,25 @@
                 <w:rFonts w:ascii="Times New Roman" w:hAnsi="Times New Roman" w:eastAsia="宋体"/>
                 <w:sz w:val="18"/>
               </w:rPr>
-              <w:t>+1.215 ns</w:t>
-            </w:r>
-          </w:p>
-        </w:tc>
-        <w:tc>
-          <w:tcPr>
-            <w:tcW w:type="dxa" w:w="2041"/>
-          </w:tcPr>
-          <w:p>
-            <w:pPr>
-              <w:spacing w:before="20" w:after="20"/>
-              <w:jc w:val="center"/>
-            </w:pPr>
-            <w:r>
-              <w:rPr>
-                <w:rFonts w:ascii="Times New Roman" w:hAnsi="Times New Roman" w:eastAsia="宋体"/>
-                <w:sz w:val="18"/>
-              </w:rPr>
-              <w:t>−0.337 ns</w:t>
+              <w:t>+1.128 ns</w:t>
+            </w:r>
+          </w:p>
+        </w:tc>
+        <w:tc>
+          <w:tcPr>
+            <w:tcW w:type="dxa" w:w="2041"/>
+          </w:tcPr>
+          <w:p>
+            <w:pPr>
+              <w:spacing w:before="20" w:after="20"/>
+              <w:jc w:val="center"/>
+            </w:pPr>
+            <w:r>
+              <w:rPr>
+                <w:rFonts w:ascii="Times New Roman" w:hAnsi="Times New Roman" w:eastAsia="宋体"/>
+                <w:sz w:val="18"/>
+              </w:rPr>
+              <w:t>−0.424 ns</w:t>
             </w:r>
           </w:p>
         </w:tc>
@@ -4879,7 +4956,7 @@
                 <w:b/>
                 <w:sz w:val="18"/>
               </w:rPr>
-              <w:t>本次修改前</w:t>
+              <w:t>首版实现</w:t>
             </w:r>
           </w:p>
         </w:tc>
@@ -4901,7 +4978,7 @@
                 <w:b/>
                 <w:sz w:val="18"/>
               </w:rPr>
-              <w:t>本次修改后</w:t>
+              <w:t>当前实现</w:t>
             </w:r>
           </w:p>
         </w:tc>
@@ -5053,25 +5130,25 @@
                 <w:rFonts w:ascii="Times New Roman" w:hAnsi="Times New Roman" w:eastAsia="宋体"/>
                 <w:sz w:val="18"/>
               </w:rPr>
-              <w:t>7,397</w:t>
-            </w:r>
-          </w:p>
-        </w:tc>
-        <w:tc>
-          <w:tcPr>
-            <w:tcW w:type="dxa" w:w="2041"/>
-          </w:tcPr>
-          <w:p>
-            <w:pPr>
-              <w:spacing w:before="20" w:after="20"/>
-              <w:jc w:val="center"/>
-            </w:pPr>
-            <w:r>
-              <w:rPr>
-                <w:rFonts w:ascii="Times New Roman" w:hAnsi="Times New Roman" w:eastAsia="宋体"/>
-                <w:sz w:val="18"/>
-              </w:rPr>
-              <w:t>+39，新增状态位与清零</w:t>
+              <w:t>7,480</w:t>
+            </w:r>
+          </w:p>
+        </w:tc>
+        <w:tc>
+          <w:tcPr>
+            <w:tcW w:type="dxa" w:w="2041"/>
+          </w:tcPr>
+          <w:p>
+            <w:pPr>
+              <w:spacing w:before="20" w:after="20"/>
+              <w:jc w:val="center"/>
+            </w:pPr>
+            <w:r>
+              <w:rPr>
+                <w:rFonts w:ascii="Times New Roman" w:hAnsi="Times New Roman" w:eastAsia="宋体"/>
+                <w:sz w:val="18"/>
+              </w:rPr>
+              <w:t>+122，新增状态位/清零/抽取选择</w:t>
             </w:r>
           </w:p>
         </w:tc>
@@ -5127,25 +5204,25 @@
                 <w:rFonts w:ascii="Times New Roman" w:hAnsi="Times New Roman" w:eastAsia="宋体"/>
                 <w:sz w:val="18"/>
               </w:rPr>
-              <w:t>+1.215 ns</w:t>
-            </w:r>
-          </w:p>
-        </w:tc>
-        <w:tc>
-          <w:tcPr>
-            <w:tcW w:type="dxa" w:w="2041"/>
-          </w:tcPr>
-          <w:p>
-            <w:pPr>
-              <w:spacing w:before="20" w:after="20"/>
-              <w:jc w:val="center"/>
-            </w:pPr>
-            <w:r>
-              <w:rPr>
-                <w:rFonts w:ascii="Times New Roman" w:hAnsi="Times New Roman" w:eastAsia="宋体"/>
-                <w:sz w:val="18"/>
-              </w:rPr>
-              <w:t>−0.337 ns</w:t>
+              <w:t>+1.128 ns</w:t>
+            </w:r>
+          </w:p>
+        </w:tc>
+        <w:tc>
+          <w:tcPr>
+            <w:tcW w:type="dxa" w:w="2041"/>
+          </w:tcPr>
+          <w:p>
+            <w:pPr>
+              <w:spacing w:before="20" w:after="20"/>
+              <w:jc w:val="center"/>
+            </w:pPr>
+            <w:r>
+              <w:rPr>
+                <w:rFonts w:ascii="Times New Roman" w:hAnsi="Times New Roman" w:eastAsia="宋体"/>
+                <w:sz w:val="18"/>
+              </w:rPr>
+              <w:t>−0.424 ns</w:t>
             </w:r>
           </w:p>
         </w:tc>
@@ -5270,7 +5347,7 @@
           <w:rFonts w:ascii="Times New Roman" w:hAnsi="Times New Roman" w:eastAsia="宋体"/>
           <w:sz w:val="24"/>
         </w:rPr>
-        <w:t xml:space="preserve">：实现后 WNS 由 +1.552 退到 +1.215，实现资源多 39 个 LUT（新增的状态位与清零逻辑本身要占地方）。逻辑精简之后扇出变大、布线更集中，关键路径随之改变。</w:t>
+        <w:t xml:space="preserve">：实现后 WNS 由 +1.552 退到 +1.128，实现资源多 122 个 LUT（状态位、脉冲清零、以及后来的抽取比选择逻辑）。逻辑精简之后扇出变大、布线更集中，关键路径随之改变。</w:t>
       </w:r>
     </w:p>
     <w:p>
@@ -5296,15 +5373,15 @@
           <w:rFonts w:ascii="Times New Roman" w:hAnsi="Times New Roman" w:eastAsia="宋体"/>
           <w:sz w:val="24"/>
         </w:rPr>
-        <w:t xml:space="preserve">，理由是裕量的绝对值：+1.215 ns 对应 20 ns 周期，仍有 </w:t>
-      </w:r>
-      <w:r>
-        <w:rPr>
-          <w:rFonts w:ascii="Times New Roman" w:hAnsi="Times New Roman" w:eastAsia="宋体"/>
-          <w:sz w:val="24"/>
-          <w:b/>
-        </w:rPr>
-        <w:t xml:space="preserve">6.1% 的余量</w:t>
+        <w:t xml:space="preserve">，理由是裕量的绝对值：+1.128 ns 对应 20 ns 周期，仍有 </w:t>
+      </w:r>
+      <w:r>
+        <w:rPr>
+          <w:rFonts w:ascii="Times New Roman" w:hAnsi="Times New Roman" w:eastAsia="宋体"/>
+          <w:sz w:val="24"/>
+          <w:b/>
+        </w:rPr>
+        <w:t xml:space="preserve">5.6% 的余量</w:t>
       </w:r>
       <w:r>
         <w:rPr>
@@ -5319,7 +5396,7 @@
           <w:sz w:val="24"/>
           <w:b/>
         </w:rPr>
-        <w:t xml:space="preserve">用 0.34ns 的裕量换掉一个会潜伏的工具依赖，值。</w:t>
+        <w:t xml:space="preserve">用 0.42ns 的裕量换掉一个会潜伏的工具依赖，值。</w:t>
       </w:r>
     </w:p>
     <w:p>
@@ -5479,7 +5556,7 @@
           <w:sz w:val="26"/>
           <w:b/>
         </w:rPr>
-        <w:t xml:space="preserve">2.5 关键设计优化：从“超容”到 35.56%</w:t>
+        <w:t xml:space="preserve">2.5 关键设计优化：从“超容”到 36.00%</w:t>
       </w:r>
     </w:p>
     <w:p>
@@ -5976,7 +6053,7 @@
                 <w:rFonts w:ascii="Times New Roman" w:hAnsi="Times New Roman" w:eastAsia="宋体"/>
                 <w:sz w:val="18"/>
               </w:rPr>
-              <w:t>7,397（35.56%）</w:t>
+              <w:t>7,480（36.00%）</w:t>
             </w:r>
           </w:p>
         </w:tc>
@@ -7354,6 +7431,98 @@
           </w:p>
         </w:tc>
       </w:tr>
+      <w:tr>
+        <w:tc>
+          <w:tcPr>
+            <w:tcW w:type="dxa" w:w="2041"/>
+          </w:tcPr>
+          <w:p>
+            <w:pPr>
+              <w:spacing w:before="20" w:after="20"/>
+              <w:jc w:val="center"/>
+            </w:pPr>
+            <w:r>
+              <w:rPr>
+                <w:rFonts w:ascii="Times New Roman" w:hAnsi="Times New Roman" w:eastAsia="宋体"/>
+                <w:sz w:val="18"/>
+              </w:rPr>
+              <w:t>⑥ 波形识别自适应抽取</w:t>
+            </w:r>
+          </w:p>
+        </w:tc>
+        <w:tc>
+          <w:tcPr>
+            <w:tcW w:type="dxa" w:w="2041"/>
+          </w:tcPr>
+          <w:p>
+            <w:pPr>
+              <w:spacing w:before="20" w:after="20"/>
+              <w:jc w:val="center"/>
+            </w:pPr>
+            <w:r>
+              <w:rPr>
+                <w:rFonts w:ascii="Times New Roman" w:hAnsi="Times New Roman" w:eastAsia="宋体"/>
+                <w:sz w:val="18"/>
+              </w:rPr>
+              <w:t>+1.128 ns</w:t>
+            </w:r>
+          </w:p>
+        </w:tc>
+        <w:tc>
+          <w:tcPr>
+            <w:tcW w:type="dxa" w:w="2041"/>
+          </w:tcPr>
+          <w:p>
+            <w:pPr>
+              <w:spacing w:before="20" w:after="20"/>
+              <w:jc w:val="center"/>
+            </w:pPr>
+            <w:r>
+              <w:rPr>
+                <w:rFonts w:ascii="Times New Roman" w:hAnsi="Times New Roman" w:eastAsia="宋体"/>
+                <w:sz w:val="18"/>
+              </w:rPr>
+              <w:t>0</w:t>
+            </w:r>
+          </w:p>
+        </w:tc>
+        <w:tc>
+          <w:tcPr>
+            <w:tcW w:type="dxa" w:w="2041"/>
+          </w:tcPr>
+          <w:p>
+            <w:pPr>
+              <w:spacing w:before="20" w:after="20"/>
+              <w:jc w:val="center"/>
+            </w:pPr>
+            <w:r>
+              <w:rPr>
+                <w:rFonts w:ascii="Times New Roman" w:hAnsi="Times New Roman" w:eastAsia="宋体"/>
+                <w:sz w:val="18"/>
+              </w:rPr>
+              <w:t>decim 随频率变化</w:t>
+            </w:r>
+          </w:p>
+        </w:tc>
+        <w:tc>
+          <w:tcPr>
+            <w:tcW w:type="dxa" w:w="2041"/>
+          </w:tcPr>
+          <w:p>
+            <w:pPr>
+              <w:spacing w:before="20" w:after="20"/>
+              <w:jc w:val="center"/>
+            </w:pPr>
+            <w:r>
+              <w:rPr>
+                <w:rFonts w:ascii="Times New Roman" w:hAnsi="Times New Roman" w:eastAsia="宋体"/>
+                <w:sz w:val="18"/>
+              </w:rPr>
+              <w:t>−0.087 ns</w:t>
+            </w:r>
+          </w:p>
+        </w:tc>
+      </w:tr>
     </w:tbl>
     <w:p>
       <w:pPr>
@@ -7472,7 +7641,7 @@
           <w:sz w:val="24"/>
           <w:b/>
         </w:rPr>
-        <w:t xml:space="preserve">7397（−5.94 个百分点）</w:t>
+        <w:t xml:space="preserve">7480（−5.94 个百分点）</w:t>
       </w:r>
       <w:r>
         <w:rPr>
@@ -7576,7 +7745,7 @@
           <w:rFonts w:ascii="Times New Roman" w:hAnsi="Times New Roman" w:eastAsia="宋体"/>
           <w:sz w:val="24"/>
         </w:rPr>
-        <w:t xml:space="preserve">：本文出现了三组不同的资源数字，分别对应不同的基线，不能互相换算——综合报告 6087 LUT（把 xfft、ILA 等 OOC IP 当黑盒，不计入）；层次报告 8587 LUT（全部计入，但当时 ILA 还开着）；实现报告 7397 LUT（ILA 已关，</w:t>
+        <w:t xml:space="preserve">：本文出现了三组不同的资源数字，分别对应不同的基线，不能互相换算——综合报告 6087 LUT（把 xfft、ILA 等 OOC IP 当黑盒，不计入）；层次报告 8587 LUT（全部计入，但当时 ILA 还开着）；实现报告 7480 LUT（ILA 已关，</w:t>
       </w:r>
       <w:r>
         <w:rPr>
@@ -12128,7 +12297,22 @@
           <w:rFonts w:ascii="Times New Roman" w:hAnsi="Times New Roman" w:eastAsia="宋体"/>
           <w:sz w:val="24"/>
         </w:rPr>
-        <w:t xml:space="preserve">· 波形识别：≤5kHz 五种场景（正弦/方波/三角/双音/异常）判别全部正确；高频段进入“其他”态，属可信闸门的设计行为。</w:t>
+        <w:t xml:space="preserve">· 波形识别：</w:t>
+      </w:r>
+      <w:r>
+        <w:rPr>
+          <w:rFonts w:ascii="Times New Roman" w:hAnsi="Times New Roman" w:eastAsia="宋体"/>
+          <w:sz w:val="24"/>
+          <w:b/>
+        </w:rPr>
+        <w:t xml:space="preserve">1k~25kHz</w:t>
+      </w:r>
+      <w:r>
+        <w:rPr>
+          <w:rFonts w:ascii="Times New Roman" w:hAnsi="Times New Roman" w:eastAsia="宋体"/>
+          <w:sz w:val="24"/>
+        </w:rPr>
+        <w:t xml:space="preserve"> 三档波形（正弦/方波/三角）全部判别正确，多次连测可重复；超过 25kHz 转入“其他”态 —— 这是板内按实测频率自适应抽取后得到的真实边界，不是靠闸门掩盖出来的。</w:t>
       </w:r>
     </w:p>
     <w:p>

</xml_diff>

<commit_message>
Carry 7407 / +1.352 through the documents
Feeding the network from the shared adaptive ratio turned out to cost less than the
rule path did: LUT falls from 7480 to 7407 and WNS rises from 1.128 to 1.352, because
the timebase branch no longer drives the feature extractor.

Timing table gains a seventh step rather than overwriting the sixth, and the
before/after table is recomputed against the first implementation.
</commit_message>
<xml_diff>
--- a/report/tech_doc_draft.docx
+++ b/report/tech_doc_draft.docx
@@ -176,15 +176,15 @@
           <w:rFonts w:ascii="Times New Roman" w:hAnsi="Times New Roman" w:eastAsia="宋体"/>
           <w:sz w:val="24"/>
         </w:rPr>
-        <w:t xml:space="preserve">实测：加 Hann 窗与抛物线插值后，泄漏由 14.7% 降至 0.9%，1kHz 读数由 976Hz 修正至 999Hz（2.4%→0.1%）；电压测量 1~4V 内最大偏差 2.8%；整片 LUT 7480（36.00%）、DSP 42.22%，50MHz 下 </w:t>
-      </w:r>
-      <w:r>
-        <w:rPr>
-          <w:rFonts w:ascii="Times New Roman" w:hAnsi="Times New Roman" w:eastAsia="宋体"/>
-          <w:sz w:val="24"/>
-          <w:b/>
-        </w:rPr>
-        <w:t xml:space="preserve">WNS +1.128 ns、零失败端点</w:t>
+        <w:t xml:space="preserve">实测：加 Hann 窗与抛物线插值后，泄漏由 14.7% 降至 0.9%，1kHz 读数由 976Hz 修正至 999Hz（2.4%→0.1%）；电压测量 1~4V 内最大偏差 2.8%；整片 LUT 7407（35.61%）、DSP 42.22%，50MHz 下 </w:t>
+      </w:r>
+      <w:r>
+        <w:rPr>
+          <w:rFonts w:ascii="Times New Roman" w:hAnsi="Times New Roman" w:eastAsia="宋体"/>
+          <w:sz w:val="24"/>
+          <w:b/>
+        </w:rPr>
+        <w:t xml:space="preserve">WNS +1.352 ns、零失败端点</w:t>
       </w:r>
       <w:r>
         <w:rPr>
@@ -918,7 +918,7 @@
           <w:rFonts w:ascii="Times New Roman" w:hAnsi="Times New Roman" w:eastAsia="宋体"/>
           <w:sz w:val="24"/>
         </w:rPr>
-        <w:t xml:space="preserve">（3）轻量化的实现约束。所有扩展功能都在既有引擎上完成，不新建独立引擎：反向变换复用同一套蝶形（仅加位反转寻址与共轭旋转因子），额外逻辑代价几乎为零；50% 帧重叠用几百个 LUT 的分布式 RAM 换取采集时间减半，不占块 RAM；窗函数切换只多用一块 1024x16 的 BRAM。十项功能全部加入后，设计为 LUT 36.00%、寄存器 15.69%、DSP 42.22%、块 RAM 22.00%，LUT 仍留有约六成余量，时序裕量 +1.128ns。</w:t>
+        <w:t xml:space="preserve">（3）轻量化的实现约束。所有扩展功能都在既有引擎上完成，不新建独立引擎：反向变换复用同一套蝶形（仅加位反转寻址与共轭旋转因子），额外逻辑代价几乎为零；50% 帧重叠用几百个 LUT 的分布式 RAM 换取采集时间减半，不占块 RAM；窗函数切换只多用一块 1024x16 的 BRAM。十项功能全部加入后，设计为 LUT 35.61%、寄存器 15.69%、DSP 42.22%、块 RAM 22.00%，LUT 仍留有约六成余量，时序裕量 +1.352ns。</w:t>
       </w:r>
     </w:p>
     <w:p>
@@ -1540,7 +1540,7 @@
                 <w:rFonts w:ascii="Times New Roman" w:hAnsi="Times New Roman" w:eastAsia="宋体"/>
                 <w:sz w:val="18"/>
               </w:rPr>
-              <w:t>LUT 36.00% / FF 15.69% / DSP 42.22% / BRAM 22.00%</w:t>
+              <w:t>LUT 35.61% / FF 15.69% / DSP 42.22% / BRAM 22.00%</w:t>
             </w:r>
           </w:p>
         </w:tc>
@@ -1576,7 +1576,7 @@
                 <w:rFonts w:ascii="Times New Roman" w:hAnsi="Times New Roman" w:eastAsia="宋体"/>
                 <w:sz w:val="18"/>
               </w:rPr>
-              <w:t>WNS +1.128ns，0 失败端点</w:t>
+              <w:t>WNS +1.352ns，0 失败端点</w:t>
             </w:r>
           </w:p>
         </w:tc>
@@ -1817,7 +1817,7 @@
           <w:sz w:val="24"/>
           <w:b/>
         </w:rPr>
-        <w:t xml:space="preserve">+1.128ns</w:t>
+        <w:t xml:space="preserve">+1.352ns</w:t>
       </w:r>
       <w:r>
         <w:rPr>
@@ -2525,25 +2525,25 @@
                 <w:rFonts w:ascii="Times New Roman" w:hAnsi="Times New Roman" w:eastAsia="宋体"/>
                 <w:sz w:val="18"/>
               </w:rPr>
-              <w:t>7,480 LUT（36.00%）/ 6,527 FF（15.69%）</w:t>
-            </w:r>
-          </w:p>
-        </w:tc>
-        <w:tc>
-          <w:tcPr>
-            <w:tcW w:type="dxa" w:w="2041"/>
-          </w:tcPr>
-          <w:p>
-            <w:pPr>
-              <w:spacing w:before="20" w:after="20"/>
-              <w:jc w:val="center"/>
-            </w:pPr>
-            <w:r>
-              <w:rPr>
-                <w:rFonts w:ascii="Times New Roman" w:hAnsi="Times New Roman" w:eastAsia="宋体"/>
-                <w:sz w:val="18"/>
-              </w:rPr>
-              <w:t>时序 +1.128ns，零失败端点</w:t>
+              <w:t>7,407 LUT（35.61%）/ 6,527 FF（15.69%）</w:t>
+            </w:r>
+          </w:p>
+        </w:tc>
+        <w:tc>
+          <w:tcPr>
+            <w:tcW w:type="dxa" w:w="2041"/>
+          </w:tcPr>
+          <w:p>
+            <w:pPr>
+              <w:spacing w:before="20" w:after="20"/>
+              <w:jc w:val="center"/>
+            </w:pPr>
+            <w:r>
+              <w:rPr>
+                <w:rFonts w:ascii="Times New Roman" w:hAnsi="Times New Roman" w:eastAsia="宋体"/>
+                <w:sz w:val="18"/>
+              </w:rPr>
+              <w:t>时序 +1.352ns，零失败端点</w:t>
             </w:r>
           </w:p>
         </w:tc>
@@ -2599,7 +2599,7 @@
                 <w:rFonts w:ascii="Times New Roman" w:hAnsi="Times New Roman" w:eastAsia="宋体"/>
                 <w:sz w:val="18"/>
               </w:rPr>
-              <w:t>加四项扩展后：8,754（42.09%）；关 ILA 后最终：7,480（36.00%）</w:t>
+              <w:t>加四项扩展后：8,754（42.09%）；关 ILA 后最终：7,407（35.61%）</w:t>
             </w:r>
           </w:p>
         </w:tc>
@@ -2683,7 +2683,7 @@
           <w:rFonts w:ascii="Times New Roman" w:hAnsi="Times New Roman" w:eastAsia="宋体"/>
           <w:sz w:val="24"/>
         </w:rPr>
-        <w:t xml:space="preserve">：v1.21 交付版为 7063 LUT（33.96%），加入四项扩展后为 8754（42.09%），但当时 ILA 调试核还开着；关闭 ILA 后最终为 7480（36.00%）。</w:t>
+        <w:t xml:space="preserve">：v1.21 交付版为 7063 LUT（33.96%），加入四项扩展后为 8754（42.09%），但当时 ILA 调试核还开着；关闭 ILA 后最终为 7407（35.61%）。</w:t>
       </w:r>
       <w:r>
         <w:rPr>
@@ -4630,25 +4630,25 @@
                 <w:rFonts w:ascii="Times New Roman" w:hAnsi="Times New Roman" w:eastAsia="宋体"/>
                 <w:sz w:val="18"/>
               </w:rPr>
-              <w:t>7,480</w:t>
-            </w:r>
-          </w:p>
-        </w:tc>
-        <w:tc>
-          <w:tcPr>
-            <w:tcW w:type="dxa" w:w="2041"/>
-          </w:tcPr>
-          <w:p>
-            <w:pPr>
-              <w:spacing w:before="20" w:after="20"/>
-              <w:jc w:val="center"/>
-            </w:pPr>
-            <w:r>
-              <w:rPr>
-                <w:rFonts w:ascii="Times New Roman" w:hAnsi="Times New Roman" w:eastAsia="宋体"/>
-                <w:sz w:val="18"/>
-              </w:rPr>
-              <w:t>+122，新增状态位/清零/抽取选择</w:t>
+              <w:t>7,407</w:t>
+            </w:r>
+          </w:p>
+        </w:tc>
+        <w:tc>
+          <w:tcPr>
+            <w:tcW w:type="dxa" w:w="2041"/>
+          </w:tcPr>
+          <w:p>
+            <w:pPr>
+              <w:spacing w:before="20" w:after="20"/>
+              <w:jc w:val="center"/>
+            </w:pPr>
+            <w:r>
+              <w:rPr>
+                <w:rFonts w:ascii="Times New Roman" w:hAnsi="Times New Roman" w:eastAsia="宋体"/>
+                <w:sz w:val="18"/>
+              </w:rPr>
+              <w:t>+49，新增状态位/清零/抽取选择</w:t>
             </w:r>
           </w:p>
         </w:tc>
@@ -4704,25 +4704,25 @@
                 <w:rFonts w:ascii="Times New Roman" w:hAnsi="Times New Roman" w:eastAsia="宋体"/>
                 <w:sz w:val="18"/>
               </w:rPr>
-              <w:t>+1.128 ns</w:t>
-            </w:r>
-          </w:p>
-        </w:tc>
-        <w:tc>
-          <w:tcPr>
-            <w:tcW w:type="dxa" w:w="2041"/>
-          </w:tcPr>
-          <w:p>
-            <w:pPr>
-              <w:spacing w:before="20" w:after="20"/>
-              <w:jc w:val="center"/>
-            </w:pPr>
-            <w:r>
-              <w:rPr>
-                <w:rFonts w:ascii="Times New Roman" w:hAnsi="Times New Roman" w:eastAsia="宋体"/>
-                <w:sz w:val="18"/>
-              </w:rPr>
-              <w:t>−0.424 ns</w:t>
+              <w:t>+1.352 ns</w:t>
+            </w:r>
+          </w:p>
+        </w:tc>
+        <w:tc>
+          <w:tcPr>
+            <w:tcW w:type="dxa" w:w="2041"/>
+          </w:tcPr>
+          <w:p>
+            <w:pPr>
+              <w:spacing w:before="20" w:after="20"/>
+              <w:jc w:val="center"/>
+            </w:pPr>
+            <w:r>
+              <w:rPr>
+                <w:rFonts w:ascii="Times New Roman" w:hAnsi="Times New Roman" w:eastAsia="宋体"/>
+                <w:sz w:val="18"/>
+              </w:rPr>
+              <w:t>−0.200 ns</w:t>
             </w:r>
           </w:p>
         </w:tc>
@@ -5130,25 +5130,25 @@
                 <w:rFonts w:ascii="Times New Roman" w:hAnsi="Times New Roman" w:eastAsia="宋体"/>
                 <w:sz w:val="18"/>
               </w:rPr>
-              <w:t>7,480</w:t>
-            </w:r>
-          </w:p>
-        </w:tc>
-        <w:tc>
-          <w:tcPr>
-            <w:tcW w:type="dxa" w:w="2041"/>
-          </w:tcPr>
-          <w:p>
-            <w:pPr>
-              <w:spacing w:before="20" w:after="20"/>
-              <w:jc w:val="center"/>
-            </w:pPr>
-            <w:r>
-              <w:rPr>
-                <w:rFonts w:ascii="Times New Roman" w:hAnsi="Times New Roman" w:eastAsia="宋体"/>
-                <w:sz w:val="18"/>
-              </w:rPr>
-              <w:t>+122，新增状态位/清零/抽取选择</w:t>
+              <w:t>7,407</w:t>
+            </w:r>
+          </w:p>
+        </w:tc>
+        <w:tc>
+          <w:tcPr>
+            <w:tcW w:type="dxa" w:w="2041"/>
+          </w:tcPr>
+          <w:p>
+            <w:pPr>
+              <w:spacing w:before="20" w:after="20"/>
+              <w:jc w:val="center"/>
+            </w:pPr>
+            <w:r>
+              <w:rPr>
+                <w:rFonts w:ascii="Times New Roman" w:hAnsi="Times New Roman" w:eastAsia="宋体"/>
+                <w:sz w:val="18"/>
+              </w:rPr>
+              <w:t>+49，新增状态位/清零/抽取选择</w:t>
             </w:r>
           </w:p>
         </w:tc>
@@ -5204,25 +5204,25 @@
                 <w:rFonts w:ascii="Times New Roman" w:hAnsi="Times New Roman" w:eastAsia="宋体"/>
                 <w:sz w:val="18"/>
               </w:rPr>
-              <w:t>+1.128 ns</w:t>
-            </w:r>
-          </w:p>
-        </w:tc>
-        <w:tc>
-          <w:tcPr>
-            <w:tcW w:type="dxa" w:w="2041"/>
-          </w:tcPr>
-          <w:p>
-            <w:pPr>
-              <w:spacing w:before="20" w:after="20"/>
-              <w:jc w:val="center"/>
-            </w:pPr>
-            <w:r>
-              <w:rPr>
-                <w:rFonts w:ascii="Times New Roman" w:hAnsi="Times New Roman" w:eastAsia="宋体"/>
-                <w:sz w:val="18"/>
-              </w:rPr>
-              <w:t>−0.424 ns</w:t>
+              <w:t>+1.352 ns</w:t>
+            </w:r>
+          </w:p>
+        </w:tc>
+        <w:tc>
+          <w:tcPr>
+            <w:tcW w:type="dxa" w:w="2041"/>
+          </w:tcPr>
+          <w:p>
+            <w:pPr>
+              <w:spacing w:before="20" w:after="20"/>
+              <w:jc w:val="center"/>
+            </w:pPr>
+            <w:r>
+              <w:rPr>
+                <w:rFonts w:ascii="Times New Roman" w:hAnsi="Times New Roman" w:eastAsia="宋体"/>
+                <w:sz w:val="18"/>
+              </w:rPr>
+              <w:t>−0.200 ns</w:t>
             </w:r>
           </w:p>
         </w:tc>
@@ -5347,7 +5347,7 @@
           <w:rFonts w:ascii="Times New Roman" w:hAnsi="Times New Roman" w:eastAsia="宋体"/>
           <w:sz w:val="24"/>
         </w:rPr>
-        <w:t xml:space="preserve">：实现后 WNS 由 +1.552 退到 +1.128，实现资源多 122 个 LUT（状态位、脉冲清零、以及后来的抽取比选择逻辑）。逻辑精简之后扇出变大、布线更集中，关键路径随之改变。</w:t>
+        <w:t xml:space="preserve">：实现后 WNS 由 +1.552 退到 +1.352，实现资源多 49 个 LUT（状态位、脉冲清零、抽取比选择，其中网络改用同源抽取后还省回一部分）。逻辑精简之后扇出变大、布线更集中，关键路径随之改变。</w:t>
       </w:r>
     </w:p>
     <w:p>
@@ -5373,15 +5373,15 @@
           <w:rFonts w:ascii="Times New Roman" w:hAnsi="Times New Roman" w:eastAsia="宋体"/>
           <w:sz w:val="24"/>
         </w:rPr>
-        <w:t xml:space="preserve">，理由是裕量的绝对值：+1.128 ns 对应 20 ns 周期，仍有 </w:t>
-      </w:r>
-      <w:r>
-        <w:rPr>
-          <w:rFonts w:ascii="Times New Roman" w:hAnsi="Times New Roman" w:eastAsia="宋体"/>
-          <w:sz w:val="24"/>
-          <w:b/>
-        </w:rPr>
-        <w:t xml:space="preserve">5.6% 的余量</w:t>
+        <w:t xml:space="preserve">，理由是裕量的绝对值：+1.352 ns 对应 20 ns 周期，仍有 </w:t>
+      </w:r>
+      <w:r>
+        <w:rPr>
+          <w:rFonts w:ascii="Times New Roman" w:hAnsi="Times New Roman" w:eastAsia="宋体"/>
+          <w:sz w:val="24"/>
+          <w:b/>
+        </w:rPr>
+        <w:t xml:space="preserve">6.8% 的余量</w:t>
       </w:r>
       <w:r>
         <w:rPr>
@@ -5396,7 +5396,7 @@
           <w:sz w:val="24"/>
           <w:b/>
         </w:rPr>
-        <w:t xml:space="preserve">用 0.42ns 的裕量换掉一个会潜伏的工具依赖，值。</w:t>
+        <w:t xml:space="preserve">用 0.20ns 的裕量换掉一个会潜伏的工具依赖，值。</w:t>
       </w:r>
     </w:p>
     <w:p>
@@ -5556,7 +5556,7 @@
           <w:sz w:val="26"/>
           <w:b/>
         </w:rPr>
-        <w:t xml:space="preserve">2.5 关键设计优化：从“超容”到 36.00%</w:t>
+        <w:t xml:space="preserve">2.5 关键设计优化：从“超容”到 35.61%</w:t>
       </w:r>
     </w:p>
     <w:p>
@@ -6053,7 +6053,7 @@
                 <w:rFonts w:ascii="Times New Roman" w:hAnsi="Times New Roman" w:eastAsia="宋体"/>
                 <w:sz w:val="18"/>
               </w:rPr>
-              <w:t>7,480（36.00%）</w:t>
+              <w:t>7,407（35.61%）</w:t>
             </w:r>
           </w:p>
         </w:tc>
@@ -7523,6 +7523,98 @@
           </w:p>
         </w:tc>
       </w:tr>
+      <w:tr>
+        <w:tc>
+          <w:tcPr>
+            <w:tcW w:type="dxa" w:w="2041"/>
+          </w:tcPr>
+          <w:p>
+            <w:pPr>
+              <w:spacing w:before="20" w:after="20"/>
+              <w:jc w:val="center"/>
+            </w:pPr>
+            <w:r>
+              <w:rPr>
+                <w:rFonts w:ascii="Times New Roman" w:hAnsi="Times New Roman" w:eastAsia="宋体"/>
+                <w:sz w:val="18"/>
+              </w:rPr>
+              <w:t>⑦ 神经网络同源抽取</w:t>
+            </w:r>
+          </w:p>
+        </w:tc>
+        <w:tc>
+          <w:tcPr>
+            <w:tcW w:type="dxa" w:w="2041"/>
+          </w:tcPr>
+          <w:p>
+            <w:pPr>
+              <w:spacing w:before="20" w:after="20"/>
+              <w:jc w:val="center"/>
+            </w:pPr>
+            <w:r>
+              <w:rPr>
+                <w:rFonts w:ascii="Times New Roman" w:hAnsi="Times New Roman" w:eastAsia="宋体"/>
+                <w:sz w:val="18"/>
+              </w:rPr>
+              <w:t>+1.352 ns</w:t>
+            </w:r>
+          </w:p>
+        </w:tc>
+        <w:tc>
+          <w:tcPr>
+            <w:tcW w:type="dxa" w:w="2041"/>
+          </w:tcPr>
+          <w:p>
+            <w:pPr>
+              <w:spacing w:before="20" w:after="20"/>
+              <w:jc w:val="center"/>
+            </w:pPr>
+            <w:r>
+              <w:rPr>
+                <w:rFonts w:ascii="Times New Roman" w:hAnsi="Times New Roman" w:eastAsia="宋体"/>
+                <w:sz w:val="18"/>
+              </w:rPr>
+              <w:t>0</w:t>
+            </w:r>
+          </w:p>
+        </w:tc>
+        <w:tc>
+          <w:tcPr>
+            <w:tcW w:type="dxa" w:w="2041"/>
+          </w:tcPr>
+          <w:p>
+            <w:pPr>
+              <w:spacing w:before="20" w:after="20"/>
+              <w:jc w:val="center"/>
+            </w:pPr>
+            <w:r>
+              <w:rPr>
+                <w:rFonts w:ascii="Times New Roman" w:hAnsi="Times New Roman" w:eastAsia="宋体"/>
+                <w:sz w:val="18"/>
+              </w:rPr>
+              <w:t>特征提取脱离时基</w:t>
+            </w:r>
+          </w:p>
+        </w:tc>
+        <w:tc>
+          <w:tcPr>
+            <w:tcW w:type="dxa" w:w="2041"/>
+          </w:tcPr>
+          <w:p>
+            <w:pPr>
+              <w:spacing w:before="20" w:after="20"/>
+              <w:jc w:val="center"/>
+            </w:pPr>
+            <w:r>
+              <w:rPr>
+                <w:rFonts w:ascii="Times New Roman" w:hAnsi="Times New Roman" w:eastAsia="宋体"/>
+                <w:sz w:val="18"/>
+              </w:rPr>
+              <w:t>+0.224 ns</w:t>
+            </w:r>
+          </w:p>
+        </w:tc>
+      </w:tr>
     </w:tbl>
     <w:p>
       <w:pPr>
@@ -7641,7 +7733,7 @@
           <w:sz w:val="24"/>
           <w:b/>
         </w:rPr>
-        <w:t xml:space="preserve">7480（−5.94 个百分点）</w:t>
+        <w:t xml:space="preserve">7407（−5.94 个百分点）</w:t>
       </w:r>
       <w:r>
         <w:rPr>
@@ -7745,7 +7837,7 @@
           <w:rFonts w:ascii="Times New Roman" w:hAnsi="Times New Roman" w:eastAsia="宋体"/>
           <w:sz w:val="24"/>
         </w:rPr>
-        <w:t xml:space="preserve">：本文出现了三组不同的资源数字，分别对应不同的基线，不能互相换算——综合报告 6087 LUT（把 xfft、ILA 等 OOC IP 当黑盒，不计入）；层次报告 8587 LUT（全部计入，但当时 ILA 还开着）；实现报告 7480 LUT（ILA 已关，</w:t>
+        <w:t xml:space="preserve">：本文出现了三组不同的资源数字，分别对应不同的基线，不能互相换算——综合报告 6087 LUT（把 xfft、ILA 等 OOC IP 当黑盒，不计入）；层次报告 8587 LUT（全部计入，但当时 ILA 还开着）；实现报告 7407 LUT（ILA 已关，</w:t>
       </w:r>
       <w:r>
         <w:rPr>
@@ -12313,6 +12405,21 @@
           <w:sz w:val="24"/>
         </w:rPr>
         <w:t xml:space="preserve"> 三档波形（正弦/方波/三角）全部判别正确，多次连测可重复；超过 25kHz 转入“其他”态 —— 这是板内按实测频率自适应抽取后得到的真实边界，不是靠闸门掩盖出来的。</w:t>
+      </w:r>
+      <w:r>
+        <w:rPr>
+          <w:rFonts w:ascii="Times New Roman" w:hAnsi="Times New Roman" w:eastAsia="宋体"/>
+          <w:sz w:val="24"/>
+          <w:b/>
+        </w:rPr>
+        <w:t xml:space="preserve">规则法与神经网络两条通路现在都达到这个边界</w:t>
+      </w:r>
+      <w:r>
+        <w:rPr>
+          <w:rFonts w:ascii="Times New Roman" w:hAnsi="Times New Roman" w:eastAsia="宋体"/>
+          <w:sz w:val="24"/>
+        </w:rPr>
+        <w:t xml:space="preserve">：改造前规则法只到 3kHz、网络只到 10kHz。</w:t>
       </w:r>
     </w:p>
     <w:p>

</xml_diff>

<commit_message>
Bring the resource figures in line with what the board actually reports
The measurements moved when the two dead ports were connected and the averager
memory started mapping to block RAM, so the document would otherwise describe a
design that no longer exists. Numbers updated to LUT 7469 at 35.91 percent, FF 6633
at 15.94 percent, WNS +1.406ns. The evolution chain keeps the older figures with
their dates, since the point of that table is that baselines differ and cannot be
subtracted.

Adds the dead-port incident as a fourth case in the verification section. It is the
most useful one to have: two features that were present in the RTL, in the protocol
document and in the host, entirely unreachable because two ports were left off an
instantiation, and synthesis had nothing to say about it. It was caught only by
sending the commands to hardware and watching for a change, which is the argument
the section is making.
</commit_message>
<xml_diff>
--- a/report/tech_doc_draft.docx
+++ b/report/tech_doc_draft.docx
@@ -176,15 +176,15 @@
           <w:rFonts w:ascii="Times New Roman" w:hAnsi="Times New Roman" w:eastAsia="宋体"/>
           <w:sz w:val="24"/>
         </w:rPr>
-        <w:t xml:space="preserve">实测：加 Hann 窗与抛物线插值后，泄漏由 14.7% 降至 0.9%，1kHz 读数由 976Hz 修正至 999Hz（2.4%→0.1%）；电压测量 1~4V 内最大偏差 2.8%；整片 LUT 7407（35.61%）、DSP 42.22%，50MHz 下 </w:t>
-      </w:r>
-      <w:r>
-        <w:rPr>
-          <w:rFonts w:ascii="Times New Roman" w:hAnsi="Times New Roman" w:eastAsia="宋体"/>
-          <w:sz w:val="24"/>
-          <w:b/>
-        </w:rPr>
-        <w:t xml:space="preserve">WNS +1.352 ns、零失败端点</w:t>
+        <w:t xml:space="preserve">实测：加 Hann 窗与抛物线插值后，泄漏由 14.7% 降至 0.9%，1kHz 读数由 976Hz 修正至 999Hz（2.4%→0.1%）；电压测量 1~4V 内最大偏差 2.8%；整片 LUT 7469（35.91%）、DSP 42.22%，50MHz 下 </w:t>
+      </w:r>
+      <w:r>
+        <w:rPr>
+          <w:rFonts w:ascii="Times New Roman" w:hAnsi="Times New Roman" w:eastAsia="宋体"/>
+          <w:sz w:val="24"/>
+          <w:b/>
+        </w:rPr>
+        <w:t xml:space="preserve">WNS +1.406 ns、零失败端点</w:t>
       </w:r>
       <w:r>
         <w:rPr>
@@ -918,7 +918,7 @@
           <w:rFonts w:ascii="Times New Roman" w:hAnsi="Times New Roman" w:eastAsia="宋体"/>
           <w:sz w:val="24"/>
         </w:rPr>
-        <w:t xml:space="preserve">（3）轻量化的实现约束。所有扩展功能都在既有引擎上完成，不新建独立引擎：反向变换复用同一套蝶形（仅加位反转寻址与共轭旋转因子），额外逻辑代价几乎为零；50% 帧重叠用几百个 LUT 的分布式 RAM 换取采集时间减半，不占块 RAM；窗函数切换只多用一块 1024x16 的 BRAM。十项功能全部加入后，设计为 LUT 35.61%、寄存器 15.69%、DSP 42.22%、块 RAM 22.00%，LUT 仍留有约六成余量，时序裕量 +1.352ns。</w:t>
+        <w:t xml:space="preserve">（3）轻量化的实现约束。所有扩展功能都在既有引擎上完成，不新建独立引擎：反向变换复用同一套蝶形（仅加位反转寻址与共轭旋转因子），额外逻辑代价几乎为零；50% 帧重叠用几百个 LUT 的分布式 RAM 换取采集时间减半，不占块 RAM；窗函数切换只多用一块 1024x16 的 BRAM。十项功能全部加入后，设计为 LUT 35.91%、寄存器 15.94%、DSP 42.22%、块 RAM 22.00%，LUT 仍留有约六成余量，时序裕量 +1.406ns。</w:t>
       </w:r>
     </w:p>
     <w:p>
@@ -1540,7 +1540,7 @@
                 <w:rFonts w:ascii="Times New Roman" w:hAnsi="Times New Roman" w:eastAsia="宋体"/>
                 <w:sz w:val="18"/>
               </w:rPr>
-              <w:t>LUT 35.61% / FF 15.69% / DSP 42.22% / BRAM 22.00%</w:t>
+              <w:t>LUT 35.91% / FF 15.94% / DSP 42.22% / BRAM 22.00%</w:t>
             </w:r>
           </w:p>
         </w:tc>
@@ -1576,7 +1576,7 @@
                 <w:rFonts w:ascii="Times New Roman" w:hAnsi="Times New Roman" w:eastAsia="宋体"/>
                 <w:sz w:val="18"/>
               </w:rPr>
-              <w:t>WNS +1.352ns，0 失败端点</w:t>
+              <w:t>WNS +1.406ns，0 失败端点</w:t>
             </w:r>
           </w:p>
         </w:tc>
@@ -1817,7 +1817,7 @@
           <w:sz w:val="24"/>
           <w:b/>
         </w:rPr>
-        <w:t xml:space="preserve">+1.352ns</w:t>
+        <w:t xml:space="preserve">+1.406ns</w:t>
       </w:r>
       <w:r>
         <w:rPr>
@@ -2525,25 +2525,25 @@
                 <w:rFonts w:ascii="Times New Roman" w:hAnsi="Times New Roman" w:eastAsia="宋体"/>
                 <w:sz w:val="18"/>
               </w:rPr>
-              <w:t>7,407 LUT（35.61%）/ 6,527 FF（15.69%）</w:t>
-            </w:r>
-          </w:p>
-        </w:tc>
-        <w:tc>
-          <w:tcPr>
-            <w:tcW w:type="dxa" w:w="2041"/>
-          </w:tcPr>
-          <w:p>
-            <w:pPr>
-              <w:spacing w:before="20" w:after="20"/>
-              <w:jc w:val="center"/>
-            </w:pPr>
-            <w:r>
-              <w:rPr>
-                <w:rFonts w:ascii="Times New Roman" w:hAnsi="Times New Roman" w:eastAsia="宋体"/>
-                <w:sz w:val="18"/>
-              </w:rPr>
-              <w:t>时序 +1.352ns，零失败端点</w:t>
+              <w:t>7,469 LUT（35.91%）/ 6,633 FF（15.94%）</w:t>
+            </w:r>
+          </w:p>
+        </w:tc>
+        <w:tc>
+          <w:tcPr>
+            <w:tcW w:type="dxa" w:w="2041"/>
+          </w:tcPr>
+          <w:p>
+            <w:pPr>
+              <w:spacing w:before="20" w:after="20"/>
+              <w:jc w:val="center"/>
+            </w:pPr>
+            <w:r>
+              <w:rPr>
+                <w:rFonts w:ascii="Times New Roman" w:hAnsi="Times New Roman" w:eastAsia="宋体"/>
+                <w:sz w:val="18"/>
+              </w:rPr>
+              <w:t>时序 +1.406ns，零失败端点</w:t>
             </w:r>
           </w:p>
         </w:tc>
@@ -2599,25 +2599,25 @@
                 <w:rFonts w:ascii="Times New Roman" w:hAnsi="Times New Roman" w:eastAsia="宋体"/>
                 <w:sz w:val="18"/>
               </w:rPr>
-              <w:t>加四项扩展后：8,754（42.09%）；关 ILA 后最终：7,407（35.61%）</w:t>
-            </w:r>
-          </w:p>
-        </w:tc>
-        <w:tc>
-          <w:tcPr>
-            <w:tcW w:type="dxa" w:w="2041"/>
-          </w:tcPr>
-          <w:p>
-            <w:pPr>
-              <w:spacing w:before="20" w:after="20"/>
-              <w:jc w:val="center"/>
-            </w:pPr>
-            <w:r>
-              <w:rPr>
-                <w:rFonts w:ascii="Times New Roman" w:hAnsi="Times New Roman" w:eastAsia="宋体"/>
-                <w:sz w:val="18"/>
-              </w:rPr>
-              <w:t>三者为不同基线，不可直接相减</w:t>
+              <w:t>加四项扩展后：8,754（42.09%）；关 ILA 后 7,407（35.61%）；10-21 修好谱平均的 BRAM 推断后 7,469（35.91%）</w:t>
+            </w:r>
+          </w:p>
+        </w:tc>
+        <w:tc>
+          <w:tcPr>
+            <w:tcW w:type="dxa" w:w="2041"/>
+          </w:tcPr>
+          <w:p>
+            <w:pPr>
+              <w:spacing w:before="20" w:after="20"/>
+              <w:jc w:val="center"/>
+            </w:pPr>
+            <w:r>
+              <w:rPr>
+                <w:rFonts w:ascii="Times New Roman" w:hAnsi="Times New Roman" w:eastAsia="宋体"/>
+                <w:sz w:val="18"/>
+              </w:rPr>
+              <w:t>四者为不同基线，不可直接相减</w:t>
             </w:r>
           </w:p>
         </w:tc>
@@ -2683,15 +2683,15 @@
           <w:rFonts w:ascii="Times New Roman" w:hAnsi="Times New Roman" w:eastAsia="宋体"/>
           <w:sz w:val="24"/>
         </w:rPr>
-        <w:t xml:space="preserve">：v1.21 交付版为 7063 LUT（33.96%），加入四项扩展后为 8754（42.09%），但当时 ILA 调试核还开着；关闭 ILA 后最终为 7407（35.61%）。</w:t>
-      </w:r>
-      <w:r>
-        <w:rPr>
-          <w:rFonts w:ascii="Times New Roman" w:hAnsi="Times New Roman" w:eastAsia="宋体"/>
-          <w:sz w:val="24"/>
-          <w:b/>
-        </w:rPr>
-        <w:t xml:space="preserve">三者的基线不同，不能直接相减得出「某项功能花了多少 LUT」</w:t>
+        <w:t xml:space="preserve">：v1.21 交付版为 7063 LUT（33.96%），加入四项扩展后为 8754（42.09%），但当时 ILA 调试核还开着；关闭 ILA 后为 7407（35.61%）；10-21 修好谱平均存储器的 BRAM 推断后为 7469（35.91%）。</w:t>
+      </w:r>
+      <w:r>
+        <w:rPr>
+          <w:rFonts w:ascii="Times New Roman" w:hAnsi="Times New Roman" w:eastAsia="宋体"/>
+          <w:sz w:val="24"/>
+          <w:b/>
+        </w:rPr>
+        <w:t xml:space="preserve">这几个数的基线不同，不能直接相减得出「某项功能花了多少 LUT」</w:t>
       </w:r>
       <w:r>
         <w:rPr>
@@ -6053,25 +6053,25 @@
                 <w:rFonts w:ascii="Times New Roman" w:hAnsi="Times New Roman" w:eastAsia="宋体"/>
                 <w:sz w:val="18"/>
               </w:rPr>
-              <w:t>7,407（35.61%）</w:t>
-            </w:r>
-          </w:p>
-        </w:tc>
-        <w:tc>
-          <w:tcPr>
-            <w:tcW w:type="dxa" w:w="2041"/>
-          </w:tcPr>
-          <w:p>
-            <w:pPr>
-              <w:spacing w:before="20" w:after="20"/>
-              <w:jc w:val="center"/>
-            </w:pPr>
-            <w:r>
-              <w:rPr>
-                <w:rFonts w:ascii="Times New Roman" w:hAnsi="Times New Roman" w:eastAsia="宋体"/>
-                <w:sz w:val="18"/>
-              </w:rPr>
-              <w:t>6,527（15.69%）</w:t>
+              <w:t>7,469（35.91%）</w:t>
+            </w:r>
+          </w:p>
+        </w:tc>
+        <w:tc>
+          <w:tcPr>
+            <w:tcW w:type="dxa" w:w="2041"/>
+          </w:tcPr>
+          <w:p>
+            <w:pPr>
+              <w:spacing w:before="20" w:after="20"/>
+              <w:jc w:val="center"/>
+            </w:pPr>
+            <w:r>
+              <w:rPr>
+                <w:rFonts w:ascii="Times New Roman" w:hAnsi="Times New Roman" w:eastAsia="宋体"/>
+                <w:sz w:val="18"/>
+              </w:rPr>
+              <w:t>6,633（15.94%）</w:t>
             </w:r>
           </w:p>
         </w:tc>
@@ -13381,7 +13381,7 @@
           <w:rFonts w:ascii="Times New Roman" w:hAnsi="Times New Roman" w:eastAsia="宋体"/>
           <w:sz w:val="24"/>
         </w:rPr>
-        <w:t xml:space="preserve">一套验证体系的价值，最终要看它有没有真的拦下错误。本项目有三例：</w:t>
+        <w:t xml:space="preserve">一套验证体系的价值，最终要看它有没有真的拦下错误。本项目有四例：</w:t>
       </w:r>
     </w:p>
     <w:p>
@@ -13533,6 +13533,53 @@
           <w:sz w:val="24"/>
         </w:rPr>
         <w:t xml:space="preserve">。综合器不报错、不警告，功能「大部分正常」，只有那一行数据永远缺失。是在做上板回归、逐行核对串口输出时，发现两行之间少了预期的一行才暴露的。修法是把状态寄存器加宽一位，并写了一个全库扫描脚本，按「常量值 ≥ 2^位宽」正则排查同类问题。</w:t>
+      </w:r>
+    </w:p>
+    <w:p>
+      <w:pPr>
+        <w:rPr>
+          <w:rFonts w:ascii="Times New Roman" w:hAnsi="Times New Roman" w:eastAsia="宋体" w:cs="Times New Roman"/>
+          <w:b/>
+          <w:sz w:val="28"/>
+        </w:rPr>
+        <w:spacing w:line="360" w:lineRule="auto"/>
+      </w:pPr>
+      <w:r>
+        <w:rPr>
+          <w:rFonts w:ascii="Times New Roman" w:hAnsi="Times New Roman" w:eastAsia="宋体"/>
+          <w:sz w:val="24"/>
+        </w:rPr>
+        <w:t xml:space="preserve">· </w:t>
+      </w:r>
+      <w:r>
+        <w:rPr>
+          <w:rFonts w:ascii="Times New Roman" w:hAnsi="Times New Roman" w:eastAsia="宋体"/>
+          <w:sz w:val="24"/>
+          <w:b/>
+        </w:rPr>
+        <w:t xml:space="preserve">两个功能从未生效（上板实测发现）</w:t>
+      </w:r>
+      <w:r>
+        <w:rPr>
+          <w:rFonts w:ascii="Times New Roman" w:hAnsi="Times New Roman" w:eastAsia="宋体"/>
+          <w:sz w:val="24"/>
+        </w:rPr>
+        <w:t xml:space="preserve">：0x97 自适应选窗与 0x98 谱平均在代码里、在协议表里、在上位机里都齐全，唯独 cmd_decoder 的实例化漏了.win_auto 与 .avg_en 两个端口。Verilog 把未连接的输入当作无驱动网络，Vivado 静默解析为 0 —— </w:t>
+      </w:r>
+      <w:r>
+        <w:rPr>
+          <w:rFonts w:ascii="Times New Roman" w:hAnsi="Times New Roman" w:eastAsia="宋体"/>
+          <w:sz w:val="24"/>
+          <w:b/>
+        </w:rPr>
+        <w:t xml:space="preserve">综合零警告</w:t>
+      </w:r>
+      <w:r>
+        <w:rPr>
+          <w:rFonts w:ascii="Times New Roman" w:hAnsi="Times New Roman" w:eastAsia="宋体"/>
+          <w:sz w:val="24"/>
+        </w:rPr>
+        <w:t xml:space="preserve">，这两个功能从写成那天起就是死的。发现方式是上板逐条发命令看 WIN= 行：手动切窗 0x90 三档全变，而 0x97 开关前后完全不动，对照之下才定位。修复后接通端口，又暴露出第二个问题：谱平均的 512×24 累加存储器因写在带异步复位的always 块里，被判定无法映射块 RAM，退化成 12597 个触发器（占全设计 FF 的 65%），整片 LUT 由此从 35.61% 冲到 53.08%。按 f_ram 的同一模板把读写口拆成两个无复位 always 后，存储器落到 1 块 RAMB36，资源回到 35.91%。</w:t>
       </w:r>
     </w:p>
     <w:p>

</xml_diff>

<commit_message>
Use the photo that actually shows the AD/DA module, and put it where the requirements ask for it
The old board photo was the main board alone - no converter module, no wiring. An arrow pointing
at 'ADC input' on a photo that does not contain the ADC module is worse than no arrow.

Replaced the annotation target with the full setup: main board, the ATK_HS_AD_DA module, and the
loopback lead all in frame. Five points now instead of four, adding the module itself so the
readers know which board they are looking at.

Filed it under 2.2.3 rather than the system overview. That section asks for module-level design
figures with the key input and output lines marked, which is exactly what an annotated setup
photo provides; 3.1 asks specifically for front and 45-degree shots and already has both.
Renumbered the figures that followed.

Behaviour is unchanged when no annotation exists - the plain photo is used and the caption drops
the arrow clause.
</commit_message>
<xml_diff>
--- a/report/tech_doc_draft.docx
+++ b/report/tech_doc_draft.docx
@@ -473,7 +473,7 @@
           <w:rFonts w:ascii="Times New Roman" w:hAnsi="Times New Roman" w:eastAsia="宋体"/>
           <w:sz w:val="20"/>
         </w:rPr>
-        <w:t xml:space="preserve">2.3.2 软件各模块介绍 ········ 9</w:t>
+        <w:t xml:space="preserve">2.3.2 软件各模块介绍 ········ 10</w:t>
       </w:r>
     </w:p>
     <w:p>
@@ -2633,6 +2633,81 @@
           <w:b/>
           <w:sz w:val="28"/>
         </w:rPr>
+        <w:ind w:firstLineChars="200"/>
+        <w:spacing w:line="360" w:lineRule="auto"/>
+      </w:pPr>
+      <w:r>
+        <w:rPr>
+          <w:rFonts w:ascii="Times New Roman" w:hAnsi="Times New Roman" w:eastAsia="宋体"/>
+          <w:sz w:val="24"/>
+        </w:rPr>
+        <w:t xml:space="preserve">完整测试连接如下：主板、ATK_HS_AD_DA 模拟模块与回环飞线同时入镜，这是实际演示时的接线状态；拔掉回环飞线即可改接外部信号源。</w:t>
+      </w:r>
+    </w:p>
+    <w:p>
+      <w:pPr>
+        <w:jc w:val="center"/>
+      </w:pPr>
+      <w:r>
+        <w:drawing>
+          <wp:inline xmlns:a="http://schemas.openxmlformats.org/drawingml/2006/main" xmlns:pic="http://schemas.openxmlformats.org/drawingml/2006/picture">
+            <wp:extent cx="5040000" cy="3780000"/>
+            <wp:docPr id="4" name="Picture 4"/>
+            <wp:cNvGraphicFramePr>
+              <a:graphicFrameLocks noChangeAspect="1"/>
+            </wp:cNvGraphicFramePr>
+            <a:graphic>
+              <a:graphicData uri="http://schemas.openxmlformats.org/drawingml/2006/picture">
+                <pic:pic>
+                  <pic:nvPicPr>
+                    <pic:cNvPr id="0" name="fig_p7_full_setup.jpg"/>
+                    <pic:cNvPicPr/>
+                  </pic:nvPicPr>
+                  <pic:blipFill>
+                    <a:blip r:embed="rId15"/>
+                    <a:stretch>
+                      <a:fillRect/>
+                    </a:stretch>
+                  </pic:blipFill>
+                  <pic:spPr>
+                    <a:xfrm>
+                      <a:off x="0" y="0"/>
+                      <a:ext cx="5040000" cy="3780000"/>
+                    </a:xfrm>
+                    <a:prstGeom prst="rect"/>
+                  </pic:spPr>
+                </pic:pic>
+              </a:graphicData>
+            </a:graphic>
+          </wp:inline>
+        </w:drawing>
+      </w:r>
+    </w:p>
+    <w:p>
+      <w:pPr>
+        <w:rPr>
+          <w:rFonts w:ascii="Times New Roman" w:hAnsi="Times New Roman" w:eastAsia="宋体" w:cs="Times New Roman"/>
+          <w:b/>
+          <w:sz w:val="28"/>
+        </w:rPr>
+        <w:jc w:val="center"/>
+        <w:spacing w:line="360" w:lineRule="auto" w:after="80"/>
+      </w:pPr>
+      <w:r>
+        <w:rPr>
+          <w:rFonts w:ascii="Times New Roman" w:hAnsi="Times New Roman" w:eastAsia="宋体"/>
+          <w:sz w:val="18"/>
+        </w:rPr>
+        <w:t xml:space="preserve">图 2-4  完整测试连接（主板 + AD/DA 模块 + 回环飞线）</w:t>
+      </w:r>
+    </w:p>
+    <w:p>
+      <w:pPr>
+        <w:rPr>
+          <w:rFonts w:ascii="Times New Roman" w:hAnsi="Times New Roman" w:eastAsia="宋体" w:cs="Times New Roman"/>
+          <w:b/>
+          <w:sz w:val="28"/>
+        </w:rPr>
         <w:jc w:val="left"/>
         <w:keepNext/>
         <w:spacing w:line="360" w:lineRule="auto" w:after="60"/>
@@ -2674,7 +2749,7 @@
         <w:drawing>
           <wp:inline xmlns:a="http://schemas.openxmlformats.org/drawingml/2006/main" xmlns:pic="http://schemas.openxmlformats.org/drawingml/2006/picture">
             <wp:extent cx="5040000" cy="2326154"/>
-            <wp:docPr id="4" name="Picture 4"/>
+            <wp:docPr id="5" name="Picture 5"/>
             <wp:cNvGraphicFramePr>
               <a:graphicFrameLocks noChangeAspect="1"/>
             </wp:cNvGraphicFramePr>
@@ -2686,7 +2761,7 @@
                     <pic:cNvPicPr/>
                   </pic:nvPicPr>
                   <pic:blipFill>
-                    <a:blip r:embed="rId15"/>
+                    <a:blip r:embed="rId16"/>
                     <a:stretch>
                       <a:fillRect/>
                     </a:stretch>
@@ -2720,7 +2795,7 @@
           <w:rFonts w:ascii="Times New Roman" w:hAnsi="Times New Roman" w:eastAsia="宋体"/>
           <w:sz w:val="18"/>
         </w:rPr>
-        <w:t xml:space="preserve">图 2-4  软件分层架构</w:t>
+        <w:t xml:space="preserve">图 2-5  软件分层架构</w:t>
       </w:r>
     </w:p>
     <w:p>
@@ -2805,7 +2880,7 @@
         <w:drawing>
           <wp:inline xmlns:a="http://schemas.openxmlformats.org/drawingml/2006/main" xmlns:pic="http://schemas.openxmlformats.org/drawingml/2006/picture">
             <wp:extent cx="5220000" cy="2569846"/>
-            <wp:docPr id="5" name="Picture 5"/>
+            <wp:docPr id="6" name="Picture 6"/>
             <wp:cNvGraphicFramePr>
               <a:graphicFrameLocks noChangeAspect="1"/>
             </wp:cNvGraphicFramePr>
@@ -2817,7 +2892,7 @@
                     <pic:cNvPicPr/>
                   </pic:nvPicPr>
                   <pic:blipFill>
-                    <a:blip r:embed="rId16"/>
+                    <a:blip r:embed="rId17"/>
                     <a:stretch>
                       <a:fillRect/>
                     </a:stretch>
@@ -2851,7 +2926,7 @@
           <w:rFonts w:ascii="Times New Roman" w:hAnsi="Times New Roman" w:eastAsia="宋体"/>
           <w:sz w:val="18"/>
         </w:rPr>
-        <w:t xml:space="preserve">图 2-5  命令解码流程与关键变量</w:t>
+        <w:t xml:space="preserve">图 2-6  命令解码流程与关键变量</w:t>
       </w:r>
     </w:p>
     <w:p>
@@ -2880,7 +2955,7 @@
         <w:drawing>
           <wp:inline xmlns:a="http://schemas.openxmlformats.org/drawingml/2006/main" xmlns:pic="http://schemas.openxmlformats.org/drawingml/2006/picture">
             <wp:extent cx="5220000" cy="2409231"/>
-            <wp:docPr id="6" name="Picture 6"/>
+            <wp:docPr id="7" name="Picture 7"/>
             <wp:cNvGraphicFramePr>
               <a:graphicFrameLocks noChangeAspect="1"/>
             </wp:cNvGraphicFramePr>
@@ -2892,7 +2967,7 @@
                     <pic:cNvPicPr/>
                   </pic:nvPicPr>
                   <pic:blipFill>
-                    <a:blip r:embed="rId17"/>
+                    <a:blip r:embed="rId18"/>
                     <a:stretch>
                       <a:fillRect/>
                     </a:stretch>
@@ -2926,7 +3001,7 @@
           <w:rFonts w:ascii="Times New Roman" w:hAnsi="Times New Roman" w:eastAsia="宋体"/>
           <w:sz w:val="18"/>
         </w:rPr>
-        <w:t xml:space="preserve">图 2-6  信号发生流程与关键变量</w:t>
+        <w:t xml:space="preserve">图 2-7  信号发生流程与关键变量</w:t>
       </w:r>
     </w:p>
     <w:p>
@@ -2955,7 +3030,7 @@
         <w:drawing>
           <wp:inline xmlns:a="http://schemas.openxmlformats.org/drawingml/2006/main" xmlns:pic="http://schemas.openxmlformats.org/drawingml/2006/picture">
             <wp:extent cx="5220000" cy="2489538"/>
-            <wp:docPr id="7" name="Picture 7"/>
+            <wp:docPr id="8" name="Picture 8"/>
             <wp:cNvGraphicFramePr>
               <a:graphicFrameLocks noChangeAspect="1"/>
             </wp:cNvGraphicFramePr>
@@ -2967,7 +3042,7 @@
                     <pic:cNvPicPr/>
                   </pic:nvPicPr>
                   <pic:blipFill>
-                    <a:blip r:embed="rId18"/>
+                    <a:blip r:embed="rId19"/>
                     <a:stretch>
                       <a:fillRect/>
                     </a:stretch>
@@ -3001,7 +3076,7 @@
           <w:rFonts w:ascii="Times New Roman" w:hAnsi="Times New Roman" w:eastAsia="宋体"/>
           <w:sz w:val="18"/>
         </w:rPr>
-        <w:t xml:space="preserve">图 2-7  采集与抽取流程及关键变量</w:t>
+        <w:t xml:space="preserve">图 2-8  采集与抽取流程及关键变量</w:t>
       </w:r>
     </w:p>
     <w:p>
@@ -3084,7 +3159,7 @@
         <w:drawing>
           <wp:inline xmlns:a="http://schemas.openxmlformats.org/drawingml/2006/main" xmlns:pic="http://schemas.openxmlformats.org/drawingml/2006/picture">
             <wp:extent cx="5220000" cy="2730462"/>
-            <wp:docPr id="8" name="Picture 8"/>
+            <wp:docPr id="9" name="Picture 9"/>
             <wp:cNvGraphicFramePr>
               <a:graphicFrameLocks noChangeAspect="1"/>
             </wp:cNvGraphicFramePr>
@@ -3096,7 +3171,7 @@
                     <pic:cNvPicPr/>
                   </pic:nvPicPr>
                   <pic:blipFill>
-                    <a:blip r:embed="rId19"/>
+                    <a:blip r:embed="rId20"/>
                     <a:stretch>
                       <a:fillRect/>
                     </a:stretch>
@@ -3130,7 +3205,7 @@
           <w:rFonts w:ascii="Times New Roman" w:hAnsi="Times New Roman" w:eastAsia="宋体"/>
           <w:sz w:val="18"/>
         </w:rPr>
-        <w:t xml:space="preserve">图 2-8  自研 FFT 流程与关键变量</w:t>
+        <w:t xml:space="preserve">图 2-9  自研 FFT 流程与关键变量</w:t>
       </w:r>
     </w:p>
     <w:p>
@@ -3235,7 +3310,7 @@
         <w:drawing>
           <wp:inline xmlns:a="http://schemas.openxmlformats.org/drawingml/2006/main" xmlns:pic="http://schemas.openxmlformats.org/drawingml/2006/picture">
             <wp:extent cx="5220000" cy="2650154"/>
-            <wp:docPr id="9" name="Picture 9"/>
+            <wp:docPr id="10" name="Picture 10"/>
             <wp:cNvGraphicFramePr>
               <a:graphicFrameLocks noChangeAspect="1"/>
             </wp:cNvGraphicFramePr>
@@ -3247,7 +3322,7 @@
                     <pic:cNvPicPr/>
                   </pic:nvPicPr>
                   <pic:blipFill>
-                    <a:blip r:embed="rId20"/>
+                    <a:blip r:embed="rId21"/>
                     <a:stretch>
                       <a:fillRect/>
                     </a:stretch>
@@ -3281,7 +3356,7 @@
           <w:rFonts w:ascii="Times New Roman" w:hAnsi="Times New Roman" w:eastAsia="宋体"/>
           <w:sz w:val="18"/>
         </w:rPr>
-        <w:t xml:space="preserve">图 2-9  锁相放大流程与关键变量</w:t>
+        <w:t xml:space="preserve">图 2-10  锁相放大流程与关键变量</w:t>
       </w:r>
     </w:p>
     <w:p>
@@ -3428,7 +3503,7 @@
         <w:drawing>
           <wp:inline xmlns:a="http://schemas.openxmlformats.org/drawingml/2006/main" xmlns:pic="http://schemas.openxmlformats.org/drawingml/2006/picture">
             <wp:extent cx="4320000" cy="3240000"/>
-            <wp:docPr id="10" name="Picture 10"/>
+            <wp:docPr id="11" name="Picture 11"/>
             <wp:cNvGraphicFramePr>
               <a:graphicFrameLocks noChangeAspect="1"/>
             </wp:cNvGraphicFramePr>
@@ -3440,7 +3515,7 @@
                     <pic:cNvPicPr/>
                   </pic:nvPicPr>
                   <pic:blipFill>
-                    <a:blip r:embed="rId21"/>
+                    <a:blip r:embed="rId22"/>
                     <a:stretch>
                       <a:fillRect/>
                     </a:stretch>
@@ -3485,7 +3560,7 @@
         <w:drawing>
           <wp:inline xmlns:a="http://schemas.openxmlformats.org/drawingml/2006/main" xmlns:pic="http://schemas.openxmlformats.org/drawingml/2006/picture">
             <wp:extent cx="4500000" cy="6000000"/>
-            <wp:docPr id="11" name="Picture 11"/>
+            <wp:docPr id="12" name="Picture 12"/>
             <wp:cNvGraphicFramePr>
               <a:graphicFrameLocks noChangeAspect="1"/>
             </wp:cNvGraphicFramePr>
@@ -3497,7 +3572,7 @@
                     <pic:cNvPicPr/>
                   </pic:nvPicPr>
                   <pic:blipFill>
-                    <a:blip r:embed="rId22"/>
+                    <a:blip r:embed="rId23"/>
                     <a:stretch>
                       <a:fillRect/>
                     </a:stretch>
@@ -3638,7 +3713,7 @@
         <w:drawing>
           <wp:inline xmlns:a="http://schemas.openxmlformats.org/drawingml/2006/main" xmlns:pic="http://schemas.openxmlformats.org/drawingml/2006/picture">
             <wp:extent cx="3960000" cy="5280943"/>
-            <wp:docPr id="12" name="Picture 12"/>
+            <wp:docPr id="13" name="Picture 13"/>
             <wp:cNvGraphicFramePr>
               <a:graphicFrameLocks noChangeAspect="1"/>
             </wp:cNvGraphicFramePr>
@@ -3650,7 +3725,7 @@
                     <pic:cNvPicPr/>
                   </pic:nvPicPr>
                   <pic:blipFill>
-                    <a:blip r:embed="rId23"/>
+                    <a:blip r:embed="rId24"/>
                     <a:stretch>
                       <a:fillRect/>
                     </a:stretch>
@@ -3733,7 +3808,7 @@
         <w:drawing>
           <wp:inline xmlns:a="http://schemas.openxmlformats.org/drawingml/2006/main" xmlns:pic="http://schemas.openxmlformats.org/drawingml/2006/picture">
             <wp:extent cx="4680000" cy="2772900"/>
-            <wp:docPr id="13" name="Picture 13"/>
+            <wp:docPr id="14" name="Picture 14"/>
             <wp:cNvGraphicFramePr>
               <a:graphicFrameLocks noChangeAspect="1"/>
             </wp:cNvGraphicFramePr>
@@ -3745,7 +3820,7 @@
                     <pic:cNvPicPr/>
                   </pic:nvPicPr>
                   <pic:blipFill>
-                    <a:blip r:embed="rId24"/>
+                    <a:blip r:embed="rId25"/>
                     <a:stretch>
                       <a:fillRect/>
                     </a:stretch>

</xml_diff>

<commit_message>
Build with the annotated setup photo
Five arrows now land on a photo that actually contains the converters, so 'ADC input' points
at the ADC module rather than at empty space on the main board.
</commit_message>
<xml_diff>
--- a/report/tech_doc_draft.docx
+++ b/report/tech_doc_draft.docx
@@ -2660,7 +2660,7 @@
               <a:graphicData uri="http://schemas.openxmlformats.org/drawingml/2006/picture">
                 <pic:pic>
                   <pic:nvPicPr>
-                    <pic:cNvPr id="0" name="fig_p7_full_setup.jpg"/>
+                    <pic:cNvPr id="0" name="fig_p7_full_setup_annotated.jpg"/>
                     <pic:cNvPicPr/>
                   </pic:nvPicPr>
                   <pic:blipFill>
@@ -2698,7 +2698,7 @@
           <w:rFonts w:ascii="Times New Roman" w:hAnsi="Times New Roman" w:eastAsia="宋体"/>
           <w:sz w:val="18"/>
         </w:rPr>
-        <w:t xml:space="preserve">图 2-4  完整测试连接（主板 + AD/DA 模块 + 回环飞线）</w:t>
+        <w:t xml:space="preserve">图 2-4  完整测试连接（主板 + AD/DA 模块 + 回环飞线，箭头标出关键接口）</w:t>
       </w:r>
     </w:p>
     <w:p>

</xml_diff>

<commit_message>
Rebuild on the Vivado project and update the resource figures to match it
The bitstream on D: was from the 24th, so it predated yesterday's lock-in checksum fix. Rebuilt
in place, four minutes, and regenerated the .mcs for flash programming.

Timing closes at WNS +0.613ns with zero failing endpoints. Resources came out at LUT 7886
(37.91%), FF 7082, BRAM 12 (24.00%), DSP 40 (44.44%) - each within a few counts of what the
document said, but 'a few counts' is still a mismatch between the paper and the bitstream a judge
would program. Updated README and the document to the numbers this build actually produced.
</commit_message>
<xml_diff>
--- a/report/tech_doc_draft.docx
+++ b/report/tech_doc_draft.docx
@@ -101,7 +101,7 @@
           <w:rFonts w:ascii="Times New Roman" w:hAnsi="Times New Roman" w:eastAsia="宋体"/>
           <w:sz w:val="24"/>
         </w:rPr>
-        <w:t xml:space="preserve">主要指标：整片 LUT 7891（37.94%）、FF 7082（17.02%）、BRAM 12（24.00%）、DSP 40（44.44%），50MHz 下 WNS +0.677ns、零失败端点。自研 FFT 核 502 LUT / 346 FF / 7 DSP，约为厂商 IP 核的三分之一。加 Hann 窗与抛物线插值后，泄漏由 14.7% 降至 0.9%，1kHz 读数由 976Hz 修正至 999Hz，误差 0.1%；电压测量在 1~4V 内最大偏差 2.8%、平均 0.8%。</w:t>
+        <w:t xml:space="preserve">主要指标：整片 LUT 7886（37.91%）、FF 7082（17.02%）、BRAM 12（24.00%）、DSP 40（44.44%），50MHz 下 WNS +0.613ns、零失败端点。自研 FFT 核 502 LUT / 346 FF / 7 DSP，约为厂商 IP 核的三分之一。加 Hann 窗与抛物线插值后，泄漏由 14.7% 降至 0.9%，1kHz 读数由 976Hz 修正至 999Hz，误差 0.1%；电压测量在 1~4V 内最大偏差 2.8%、平均 0.8%。</w:t>
       </w:r>
     </w:p>
     <w:p>
@@ -1900,7 +1900,7 @@
                 <w:rFonts w:ascii="Times New Roman" w:hAnsi="Times New Roman" w:eastAsia="宋体"/>
                 <w:sz w:val="18"/>
               </w:rPr>
-              <w:t>LUT 37.94% / FF 17.02% / BRAM 24.00% / DSP 44.44%</w:t>
+              <w:t>LUT 37.91% / FF 17.02% / BRAM 24.00% / DSP 44.44%</w:t>
             </w:r>
           </w:p>
         </w:tc>
@@ -1936,7 +1936,7 @@
                 <w:rFonts w:ascii="Times New Roman" w:hAnsi="Times New Roman" w:eastAsia="宋体"/>
                 <w:sz w:val="18"/>
               </w:rPr>
-              <w:t>WNS +0.677ns，0 失败端点</w:t>
+              <w:t>WNS +0.613ns，0 失败端点</w:t>
             </w:r>
           </w:p>
         </w:tc>
@@ -4225,7 +4225,7 @@
           <w:rFonts w:ascii="Times New Roman" w:hAnsi="Times New Roman" w:eastAsia="宋体"/>
           <w:sz w:val="24"/>
         </w:rPr>
-        <w:t xml:space="preserve">（14）帧率与资源。幅度谱帧率 21.2 帧/s；整片 LUT 7891（37.94%）、FF 7082（17.02%）、BRAM 12（24.00%）、DSP 40（44.44%），50MHz 下 WNS +0.677ns、WHS +0.056ns，零失败端点。</w:t>
+        <w:t xml:space="preserve">（14）帧率与资源。幅度谱帧率 21.2 帧/s；整片 LUT 7886（37.91%）、FF 7082（17.02%）、BRAM 12（24.00%）、DSP 40（44.44%），50MHz 下 WNS +0.613ns、WHS +0.057ns，零失败端点。</w:t>
       </w:r>
     </w:p>
     <w:p>

</xml_diff>

<commit_message>
Put both modules in the document, and fix the gap the mic photo exposes
The selectivity measurement said the reference was swept with an external source, but never said
how the sound got into the board. A judge asking that question would have found nothing behind it.
The path is: phone speaker, air, MAX9814 module, AD input, FPGA - and now there is a photo of the
module wired in, plus that sentence.

Second photo is the low-pass board itself, at 3.5.3 where the DUT is described.

Figure numbers now follow appearance order rather than the order I happened to add them:
3-5 mic module, 3-6 selectivity curve, 3-7 filter board, 3-8 measured Bode plot. Moved the Bode
plot from 3.5.1 to the end of 3.5.3 as well, since showing the result before describing the device
always reads backwards.

Also pulled in the two large portrait photos that were forcing near-empty pages - 29 pages now
against 31.
</commit_message>
<xml_diff>
--- a/report/tech_doc_draft.docx
+++ b/report/tech_doc_draft.docx
@@ -581,7 +581,7 @@
           <w:rFonts w:ascii="Times New Roman" w:hAnsi="Times New Roman" w:eastAsia="宋体"/>
           <w:sz w:val="20"/>
         </w:rPr>
-        <w:t xml:space="preserve">3.2.3 软件成果 ··············  17</w:t>
+        <w:t xml:space="preserve">3.2.3 软件成果 ··············  16</w:t>
       </w:r>
     </w:p>
     <w:p>
@@ -599,7 +599,7 @@
           <w:rFonts w:ascii="Times New Roman" w:hAnsi="Times New Roman" w:eastAsia="宋体"/>
           <w:sz w:val="21"/>
         </w:rPr>
-        <w:t xml:space="preserve">3.3 特性成果 ··················  18</w:t>
+        <w:t xml:space="preserve">3.3 特性成果 ··················  17</w:t>
       </w:r>
     </w:p>
     <w:p>
@@ -617,7 +617,7 @@
           <w:rFonts w:ascii="Times New Roman" w:hAnsi="Times New Roman" w:eastAsia="宋体"/>
           <w:sz w:val="21"/>
         </w:rPr>
-        <w:t xml:space="preserve">3.4 设计取舍 ··················  22</w:t>
+        <w:t xml:space="preserve">3.4 设计取舍 ··················  21</w:t>
       </w:r>
     </w:p>
     <w:p>
@@ -635,7 +635,7 @@
           <w:rFonts w:ascii="Times New Roman" w:hAnsi="Times New Roman" w:eastAsia="宋体"/>
           <w:sz w:val="20"/>
         </w:rPr>
-        <w:t xml:space="preserve">3.4.1 频谱核：自研 1024 点，而非直接例化 IP ····  22</w:t>
+        <w:t xml:space="preserve">3.4.1 频谱核：自研 1024 点，而非直接例化 IP ····  21</w:t>
       </w:r>
     </w:p>
     <w:p>
@@ -653,7 +653,7 @@
           <w:rFonts w:ascii="Times New Roman" w:hAnsi="Times New Roman" w:eastAsia="宋体"/>
           <w:sz w:val="20"/>
         </w:rPr>
-        <w:t xml:space="preserve">3.4.2 点数与精度：用 1/4 的点数，达到同等的频率精度 ····  23</w:t>
+        <w:t xml:space="preserve">3.4.2 点数与精度：用 1/4 的点数，达到同等的频率精度 ····  22</w:t>
       </w:r>
     </w:p>
     <w:p>
@@ -671,7 +671,7 @@
           <w:rFonts w:ascii="Times New Roman" w:hAnsi="Times New Roman" w:eastAsia="宋体"/>
           <w:sz w:val="20"/>
         </w:rPr>
-        <w:t xml:space="preserve">3.4.3 锁相：数字相干解调，而非模拟相敏检波 ····  23</w:t>
+        <w:t xml:space="preserve">3.4.3 锁相：数字相干解调，而非模拟相敏检波 ····  22</w:t>
       </w:r>
     </w:p>
     <w:p>
@@ -689,7 +689,7 @@
           <w:rFonts w:ascii="Times New Roman" w:hAnsi="Times New Roman" w:eastAsia="宋体"/>
           <w:sz w:val="21"/>
         </w:rPr>
-        <w:t xml:space="preserve">3.5 扩展应用：二端网络的幅频与相频测量 ····  24</w:t>
+        <w:t xml:space="preserve">3.5 扩展应用：二端网络的幅频与相频测量 ····  23</w:t>
       </w:r>
     </w:p>
     <w:p>
@@ -707,7 +707,7 @@
           <w:rFonts w:ascii="Times New Roman" w:hAnsi="Times New Roman" w:eastAsia="宋体"/>
           <w:sz w:val="20"/>
         </w:rPr>
-        <w:t xml:space="preserve">3.5.1 方法：直通校准 ········  24</w:t>
+        <w:t xml:space="preserve">3.5.1 方法：直通校准 ········  23</w:t>
       </w:r>
     </w:p>
     <w:p>
@@ -725,7 +725,7 @@
           <w:rFonts w:ascii="Times New Roman" w:hAnsi="Times New Roman" w:eastAsia="宋体"/>
           <w:sz w:val="20"/>
         </w:rPr>
-        <w:t xml:space="preserve">3.5.2 系统自身响应（直通） ····  25</w:t>
+        <w:t xml:space="preserve">3.5.2 系统自身响应（直通） ····  24</w:t>
       </w:r>
     </w:p>
     <w:p>
@@ -743,7 +743,7 @@
           <w:rFonts w:ascii="Times New Roman" w:hAnsi="Times New Roman" w:eastAsia="宋体"/>
           <w:sz w:val="20"/>
         </w:rPr>
-        <w:t xml:space="preserve">3.5.3 被测件：一阶有源低通 ····  26</w:t>
+        <w:t xml:space="preserve">3.5.3 被测件：一阶有源低通 ····  24</w:t>
       </w:r>
     </w:p>
     <w:p>
@@ -779,7 +779,7 @@
           <w:rFonts w:ascii="Times New Roman" w:hAnsi="Times New Roman" w:eastAsia="宋体"/>
           <w:sz w:val="20"/>
         </w:rPr>
-        <w:t xml:space="preserve">3.5.5 顺带得到的一条量程边界 ····  27</w:t>
+        <w:t xml:space="preserve">3.5.5 顺带得到的一条量程边界 ····  26</w:t>
       </w:r>
     </w:p>
     <w:p>
@@ -797,7 +797,7 @@
           <w:rFonts w:ascii="Times New Roman" w:hAnsi="Times New Roman" w:eastAsia="宋体"/>
           <w:sz w:val="20"/>
         </w:rPr>
-        <w:t xml:space="preserve">3.5.6 工程说明 ··············  27</w:t>
+        <w:t xml:space="preserve">3.5.6 工程说明 ··············  26</w:t>
       </w:r>
     </w:p>
     <w:p>
@@ -851,7 +851,7 @@
           <w:rFonts w:ascii="Times New Roman" w:hAnsi="Times New Roman" w:eastAsia="宋体"/>
           <w:sz w:val="21"/>
         </w:rPr>
-        <w:t xml:space="preserve">4.2 心得体会 ··················  28</w:t>
+        <w:t xml:space="preserve">4.2 心得体会 ··················  27</w:t>
       </w:r>
     </w:p>
     <w:p>
@@ -869,7 +869,7 @@
           <w:rFonts w:ascii="Times New Roman" w:hAnsi="Times New Roman" w:eastAsia="宋体"/>
           <w:sz w:val="21"/>
         </w:rPr>
-        <w:t xml:space="preserve">第五部分  参考文献 ··············  29</w:t>
+        <w:t xml:space="preserve">第五部分  参考文献 ··············  28</w:t>
       </w:r>
     </w:p>
     <w:p>
@@ -3784,7 +3784,7 @@
       <w:r>
         <w:drawing>
           <wp:inline xmlns:a="http://schemas.openxmlformats.org/drawingml/2006/main" xmlns:pic="http://schemas.openxmlformats.org/drawingml/2006/picture">
-            <wp:extent cx="4500000" cy="6000000"/>
+            <wp:extent cx="3600000" cy="4800000"/>
             <wp:docPr id="12" name="Picture 12"/>
             <wp:cNvGraphicFramePr>
               <a:graphicFrameLocks noChangeAspect="1"/>
@@ -3805,7 +3805,7 @@
                   <pic:spPr>
                     <a:xfrm>
                       <a:off x="0" y="0"/>
-                      <a:ext cx="4500000" cy="6000000"/>
+                      <a:ext cx="3600000" cy="4800000"/>
                     </a:xfrm>
                     <a:prstGeom prst="rect"/>
                   </pic:spPr>
@@ -3937,7 +3937,7 @@
       <w:r>
         <w:drawing>
           <wp:inline xmlns:a="http://schemas.openxmlformats.org/drawingml/2006/main" xmlns:pic="http://schemas.openxmlformats.org/drawingml/2006/picture">
-            <wp:extent cx="3960000" cy="5280943"/>
+            <wp:extent cx="3420000" cy="4560814"/>
             <wp:docPr id="13" name="Picture 13"/>
             <wp:cNvGraphicFramePr>
               <a:graphicFrameLocks noChangeAspect="1"/>
@@ -3958,7 +3958,7 @@
                   <pic:spPr>
                     <a:xfrm>
                       <a:off x="0" y="0"/>
-                      <a:ext cx="3960000" cy="5280943"/>
+                      <a:ext cx="3420000" cy="4560814"/>
                     </a:xfrm>
                     <a:prstGeom prst="rect"/>
                   </pic:spPr>
@@ -4297,7 +4297,64 @@
           <w:rFonts w:ascii="Times New Roman" w:hAnsi="Times New Roman" w:eastAsia="宋体"/>
           <w:sz w:val="24"/>
         </w:rPr>
-        <w:t xml:space="preserve">（10b）锁相放大的频率选择性（实测）。上述 −18.8dB 数据说明锁相能在噪声中提取信号，但没有回答另一个更基本的问题：它到底只认多窄的一段频率？为此做了独立测试 —— 参考频率固定 1000Hz，用外部音源在 500Hz~2kHz 之间逐点改变信号频率，每个频点读一次锁相幅度。结果见图 3-5。</w:t>
+        <w:t xml:space="preserve">（10b）锁相放大的频率选择性（实测）。上述 −18.8dB 数据说明锁相能在噪声中提取信号，但没有回答另一个更基本的问题：它到底只认多窄的一段频率？为此做了独立测试 —— 参考频率固定 1000Hz，用外部音源在 500Hz~2kHz 之间逐点改变信号频率，每个频点读一次锁相幅度。音源经一只 MAX9814 麦克风模块接入 AD 输入端（图 3-5），信号路径为：手机扬声器 → 空气 → 麦克风模块 → AD 输入 → FPGA。结果见图 3-6。</w:t>
+      </w:r>
+    </w:p>
+    <w:p>
+      <w:pPr>
+        <w:jc w:val="center"/>
+      </w:pPr>
+      <w:r>
+        <w:drawing>
+          <wp:inline xmlns:a="http://schemas.openxmlformats.org/drawingml/2006/main" xmlns:pic="http://schemas.openxmlformats.org/drawingml/2006/picture">
+            <wp:extent cx="3060000" cy="4080000"/>
+            <wp:docPr id="15" name="Picture 15"/>
+            <wp:cNvGraphicFramePr>
+              <a:graphicFrameLocks noChangeAspect="1"/>
+            </wp:cNvGraphicFramePr>
+            <a:graphic>
+              <a:graphicData uri="http://schemas.openxmlformats.org/drawingml/2006/picture">
+                <pic:pic>
+                  <pic:nvPicPr>
+                    <pic:cNvPr id="0" name="fig_mic_module.jpg"/>
+                    <pic:cNvPicPr/>
+                  </pic:nvPicPr>
+                  <pic:blipFill>
+                    <a:blip r:embed="rId26"/>
+                    <a:stretch>
+                      <a:fillRect/>
+                    </a:stretch>
+                  </pic:blipFill>
+                  <pic:spPr>
+                    <a:xfrm>
+                      <a:off x="0" y="0"/>
+                      <a:ext cx="3060000" cy="4080000"/>
+                    </a:xfrm>
+                    <a:prstGeom prst="rect"/>
+                  </pic:spPr>
+                </pic:pic>
+              </a:graphicData>
+            </a:graphic>
+          </wp:inline>
+        </w:drawing>
+      </w:r>
+    </w:p>
+    <w:p>
+      <w:pPr>
+        <w:rPr>
+          <w:rFonts w:ascii="Times New Roman" w:hAnsi="Times New Roman" w:eastAsia="宋体" w:cs="Times New Roman"/>
+          <w:b/>
+          <w:sz w:val="28"/>
+        </w:rPr>
+        <w:jc w:val="center"/>
+        <w:spacing w:line="360" w:lineRule="auto" w:after="80"/>
+      </w:pPr>
+      <w:r>
+        <w:rPr>
+          <w:rFonts w:ascii="Times New Roman" w:hAnsi="Times New Roman" w:eastAsia="宋体"/>
+          <w:sz w:val="18"/>
+        </w:rPr>
+        <w:t xml:space="preserve">图 3-5  外部声源经麦克风模块接入 AD 输入端</w:t>
       </w:r>
     </w:p>
     <w:p>
@@ -4326,7 +4383,7 @@
         <w:drawing>
           <wp:inline xmlns:a="http://schemas.openxmlformats.org/drawingml/2006/main" xmlns:pic="http://schemas.openxmlformats.org/drawingml/2006/picture">
             <wp:extent cx="5400000" cy="4365872"/>
-            <wp:docPr id="15" name="Picture 15"/>
+            <wp:docPr id="16" name="Picture 16"/>
             <wp:cNvGraphicFramePr>
               <a:graphicFrameLocks noChangeAspect="1"/>
             </wp:cNvGraphicFramePr>
@@ -4338,7 +4395,7 @@
                     <pic:cNvPicPr/>
                   </pic:nvPicPr>
                   <pic:blipFill>
-                    <a:blip r:embed="rId26"/>
+                    <a:blip r:embed="rId27"/>
                     <a:stretch>
                       <a:fillRect/>
                     </a:stretch>
@@ -4372,7 +4429,7 @@
           <w:rFonts w:ascii="Times New Roman" w:hAnsi="Times New Roman" w:eastAsia="宋体"/>
           <w:sz w:val="18"/>
         </w:rPr>
-        <w:t xml:space="preserve">图 3-5  锁相放大器的实测频率选择性（参考 1000Hz，积分 32 周期）</w:t>
+        <w:t xml:space="preserve">图 3-6  锁相放大器的实测频率选择性（参考 1000Hz，积分 32 周期）</w:t>
       </w:r>
     </w:p>
     <w:p>
@@ -6256,13 +6313,89 @@
     </w:p>
     <w:p>
       <w:pPr>
+        <w:rPr>
+          <w:rFonts w:ascii="Times New Roman" w:hAnsi="Times New Roman" w:eastAsia="宋体" w:cs="Times New Roman"/>
+          <w:b/>
+          <w:sz w:val="28"/>
+        </w:rPr>
+        <w:jc w:val="left"/>
+        <w:keepNext/>
+        <w:spacing w:line="360" w:lineRule="auto" w:after="40"/>
+      </w:pPr>
+      <w:r>
+        <w:rPr>
+          <w:rFonts w:ascii="Times New Roman" w:hAnsi="Times New Roman" w:eastAsia="宋体"/>
+          <w:sz w:val="24"/>
+          <w:b/>
+        </w:rPr>
+        <w:t xml:space="preserve">3.5.2 系统自身响应（直通）</w:t>
+      </w:r>
+    </w:p>
+    <w:p>
+      <w:pPr>
+        <w:rPr>
+          <w:rFonts w:ascii="Times New Roman" w:hAnsi="Times New Roman" w:eastAsia="宋体" w:cs="Times New Roman"/>
+          <w:b/>
+          <w:sz w:val="28"/>
+        </w:rPr>
+        <w:ind w:firstLineChars="200"/>
+        <w:spacing w:line="360" w:lineRule="auto"/>
+      </w:pPr>
+      <w:r>
+        <w:rPr>
+          <w:rFonts w:ascii="Times New Roman" w:hAnsi="Times New Roman" w:eastAsia="宋体"/>
+          <w:sz w:val="24"/>
+        </w:rPr>
+        <w:t xml:space="preserve">直通一遍的结果本身就是一个指标：本系统在 1MHz 内的幅频不平坦度为 0.034dB（1kHz 为基准，100kHz 处 +0.006dB，464kHz 处 −0.004dB，1MHz 处 −0.034dB）。这个数字说明后续测量可以放心把系统当作平坦通路，同时也解释了为什么两遍归一化后的结果几乎不发生变化 —— 系统确实没有多少可扣的。</w:t>
+      </w:r>
+    </w:p>
+    <w:p>
+      <w:pPr>
+        <w:rPr>
+          <w:rFonts w:ascii="Times New Roman" w:hAnsi="Times New Roman" w:eastAsia="宋体" w:cs="Times New Roman"/>
+          <w:b/>
+          <w:sz w:val="28"/>
+        </w:rPr>
+        <w:jc w:val="left"/>
+        <w:keepNext/>
+        <w:spacing w:line="360" w:lineRule="auto" w:after="40"/>
+      </w:pPr>
+      <w:r>
+        <w:rPr>
+          <w:rFonts w:ascii="Times New Roman" w:hAnsi="Times New Roman" w:eastAsia="宋体"/>
+          <w:sz w:val="24"/>
+          <w:b/>
+        </w:rPr>
+        <w:t xml:space="preserve">3.5.3 被测件：一阶有源低通</w:t>
+      </w:r>
+    </w:p>
+    <w:p>
+      <w:pPr>
+        <w:rPr>
+          <w:rFonts w:ascii="Times New Roman" w:hAnsi="Times New Roman" w:eastAsia="宋体" w:cs="Times New Roman"/>
+          <w:b/>
+          <w:sz w:val="28"/>
+        </w:rPr>
+        <w:ind w:firstLineChars="200"/>
+        <w:spacing w:line="360" w:lineRule="auto"/>
+      </w:pPr>
+      <w:r>
+        <w:rPr>
+          <w:rFonts w:ascii="Times New Roman" w:hAnsi="Times New Roman" w:eastAsia="宋体"/>
+          <w:sz w:val="24"/>
+        </w:rPr>
+        <w:t xml:space="preserve">被测件为自行搭焊的一阶有源低通，R=2.2kΩ、C=4.7nF，运放 NE5532，供电压 ±12V。按标称值计算，理论截止频率为 1/(2πRC)=15393Hz。实物见图 3-7。</w:t>
+      </w:r>
+    </w:p>
+    <w:p>
+      <w:pPr>
         <w:jc w:val="center"/>
       </w:pPr>
       <w:r>
         <w:drawing>
           <wp:inline xmlns:a="http://schemas.openxmlformats.org/drawingml/2006/main" xmlns:pic="http://schemas.openxmlformats.org/drawingml/2006/picture">
-            <wp:extent cx="5580000" cy="4963198"/>
-            <wp:docPr id="16" name="Picture 16"/>
+            <wp:extent cx="3060000" cy="4080000"/>
+            <wp:docPr id="17" name="Picture 17"/>
             <wp:cNvGraphicFramePr>
               <a:graphicFrameLocks noChangeAspect="1"/>
             </wp:cNvGraphicFramePr>
@@ -6270,11 +6403,11 @@
               <a:graphicData uri="http://schemas.openxmlformats.org/drawingml/2006/picture">
                 <pic:pic>
                   <pic:nvPicPr>
-                    <pic:cNvPr id="0" name="lockin_bode_dut.png"/>
+                    <pic:cNvPr id="0" name="fig_lpf_module.jpg"/>
                     <pic:cNvPicPr/>
                   </pic:nvPicPr>
                   <pic:blipFill>
-                    <a:blip r:embed="rId27"/>
+                    <a:blip r:embed="rId28"/>
                     <a:stretch>
                       <a:fillRect/>
                     </a:stretch>
@@ -6282,7 +6415,7 @@
                   <pic:spPr>
                     <a:xfrm>
                       <a:off x="0" y="0"/>
-                      <a:ext cx="5580000" cy="4963198"/>
+                      <a:ext cx="3060000" cy="4080000"/>
                     </a:xfrm>
                     <a:prstGeom prst="rect"/>
                   </pic:spPr>
@@ -6308,101 +6441,7 @@
           <w:rFonts w:ascii="Times New Roman" w:hAnsi="Times New Roman" w:eastAsia="宋体"/>
           <w:sz w:val="18"/>
         </w:rPr>
-        <w:t xml:space="preserve">图 3-6  一阶有源低通的实测波特图（上：幅频；下：相频）</w:t>
-      </w:r>
-    </w:p>
-    <w:p>
-      <w:pPr>
-        <w:rPr>
-          <w:rFonts w:ascii="Times New Roman" w:hAnsi="Times New Roman" w:eastAsia="宋体" w:cs="Times New Roman"/>
-          <w:b/>
-          <w:sz w:val="28"/>
-        </w:rPr>
-        <w:ind w:firstLineChars="200"/>
-        <w:spacing w:line="360" w:lineRule="auto"/>
-      </w:pPr>
-      <w:r>
-        <w:rPr>
-          <w:rFonts w:ascii="Times New Roman" w:hAnsi="Times New Roman" w:eastAsia="宋体"/>
-          <w:sz w:val="24"/>
-        </w:rPr>
-        <w:t xml:space="preserve">图 3-6 中灰线为由拟合参数生成的理论曲线，圆点为锁相实测，方块为峰峰值直接测量。可以看到三条信息：一是实测点与理论曲线在通带内几乎重合；二是 300kHz 之后方块点明显高于圆点，说明峰峰值已失效；三是相频曲线在中频段穿过 90°，高频段继续下探。</w:t>
-      </w:r>
-    </w:p>
-    <w:p>
-      <w:pPr>
-        <w:rPr>
-          <w:rFonts w:ascii="Times New Roman" w:hAnsi="Times New Roman" w:eastAsia="宋体" w:cs="Times New Roman"/>
-          <w:b/>
-          <w:sz w:val="28"/>
-        </w:rPr>
-        <w:jc w:val="left"/>
-        <w:keepNext/>
-        <w:spacing w:line="360" w:lineRule="auto" w:after="40"/>
-      </w:pPr>
-      <w:r>
-        <w:rPr>
-          <w:rFonts w:ascii="Times New Roman" w:hAnsi="Times New Roman" w:eastAsia="宋体"/>
-          <w:sz w:val="24"/>
-          <w:b/>
-        </w:rPr>
-        <w:t xml:space="preserve">3.5.2 系统自身响应（直通）</w:t>
-      </w:r>
-    </w:p>
-    <w:p>
-      <w:pPr>
-        <w:rPr>
-          <w:rFonts w:ascii="Times New Roman" w:hAnsi="Times New Roman" w:eastAsia="宋体" w:cs="Times New Roman"/>
-          <w:b/>
-          <w:sz w:val="28"/>
-        </w:rPr>
-        <w:ind w:firstLineChars="200"/>
-        <w:spacing w:line="360" w:lineRule="auto"/>
-      </w:pPr>
-      <w:r>
-        <w:rPr>
-          <w:rFonts w:ascii="Times New Roman" w:hAnsi="Times New Roman" w:eastAsia="宋体"/>
-          <w:sz w:val="24"/>
-        </w:rPr>
-        <w:t xml:space="preserve">直通一遍的结果本身就是一个指标：本系统在 1MHz 内的幅频不平坦度为 0.034dB（1kHz 为基准，100kHz 处 +0.006dB，464kHz 处 −0.004dB，1MHz 处 −0.034dB）。这个数字说明后续测量可以放心把系统当作平坦通路，同时也解释了为什么两遍归一化后的结果几乎不发生变化 —— 系统确实没有多少可扣的。</w:t>
-      </w:r>
-    </w:p>
-    <w:p>
-      <w:pPr>
-        <w:rPr>
-          <w:rFonts w:ascii="Times New Roman" w:hAnsi="Times New Roman" w:eastAsia="宋体" w:cs="Times New Roman"/>
-          <w:b/>
-          <w:sz w:val="28"/>
-        </w:rPr>
-        <w:jc w:val="left"/>
-        <w:keepNext/>
-        <w:spacing w:line="360" w:lineRule="auto" w:after="40"/>
-      </w:pPr>
-      <w:r>
-        <w:rPr>
-          <w:rFonts w:ascii="Times New Roman" w:hAnsi="Times New Roman" w:eastAsia="宋体"/>
-          <w:sz w:val="24"/>
-          <w:b/>
-        </w:rPr>
-        <w:t xml:space="preserve">3.5.3 被测件：一阶有源低通</w:t>
-      </w:r>
-    </w:p>
-    <w:p>
-      <w:pPr>
-        <w:rPr>
-          <w:rFonts w:ascii="Times New Roman" w:hAnsi="Times New Roman" w:eastAsia="宋体" w:cs="Times New Roman"/>
-          <w:b/>
-          <w:sz w:val="28"/>
-        </w:rPr>
-        <w:ind w:firstLineChars="200"/>
-        <w:spacing w:line="360" w:lineRule="auto"/>
-      </w:pPr>
-      <w:r>
-        <w:rPr>
-          <w:rFonts w:ascii="Times New Roman" w:hAnsi="Times New Roman" w:eastAsia="宋体"/>
-          <w:sz w:val="24"/>
-        </w:rPr>
-        <w:t xml:space="preserve">被测件为自行搭焊的一阶有源低通，R=2.2kΩ、C=4.7nF，运放 NE5532，供电压 ±12V。按标称值计算，理论截止频率为 1/(2πRC)=15393Hz。</w:t>
+        <w:t xml:space="preserve">图 3-7  被测件：一阶有源低通（2.2kΩ + 4.7nF + NE5532，±12V 双电源）</w:t>
       </w:r>
     </w:p>
     <w:tbl>
@@ -6905,6 +6944,81 @@
         </w:tc>
       </w:tr>
     </w:tbl>
+    <w:p>
+      <w:pPr>
+        <w:jc w:val="center"/>
+      </w:pPr>
+      <w:r>
+        <w:drawing>
+          <wp:inline xmlns:a="http://schemas.openxmlformats.org/drawingml/2006/main" xmlns:pic="http://schemas.openxmlformats.org/drawingml/2006/picture">
+            <wp:extent cx="5580000" cy="4963198"/>
+            <wp:docPr id="18" name="Picture 18"/>
+            <wp:cNvGraphicFramePr>
+              <a:graphicFrameLocks noChangeAspect="1"/>
+            </wp:cNvGraphicFramePr>
+            <a:graphic>
+              <a:graphicData uri="http://schemas.openxmlformats.org/drawingml/2006/picture">
+                <pic:pic>
+                  <pic:nvPicPr>
+                    <pic:cNvPr id="0" name="lockin_bode_dut.png"/>
+                    <pic:cNvPicPr/>
+                  </pic:nvPicPr>
+                  <pic:blipFill>
+                    <a:blip r:embed="rId29"/>
+                    <a:stretch>
+                      <a:fillRect/>
+                    </a:stretch>
+                  </pic:blipFill>
+                  <pic:spPr>
+                    <a:xfrm>
+                      <a:off x="0" y="0"/>
+                      <a:ext cx="5580000" cy="4963198"/>
+                    </a:xfrm>
+                    <a:prstGeom prst="rect"/>
+                  </pic:spPr>
+                </pic:pic>
+              </a:graphicData>
+            </a:graphic>
+          </wp:inline>
+        </w:drawing>
+      </w:r>
+    </w:p>
+    <w:p>
+      <w:pPr>
+        <w:rPr>
+          <w:rFonts w:ascii="Times New Roman" w:hAnsi="Times New Roman" w:eastAsia="宋体" w:cs="Times New Roman"/>
+          <w:b/>
+          <w:sz w:val="28"/>
+        </w:rPr>
+        <w:jc w:val="center"/>
+        <w:spacing w:line="360" w:lineRule="auto" w:after="80"/>
+      </w:pPr>
+      <w:r>
+        <w:rPr>
+          <w:rFonts w:ascii="Times New Roman" w:hAnsi="Times New Roman" w:eastAsia="宋体"/>
+          <w:sz w:val="18"/>
+        </w:rPr>
+        <w:t xml:space="preserve">图 3-8  一阶有源低通的实测波特图（上：幅频；下：相频）</w:t>
+      </w:r>
+    </w:p>
+    <w:p>
+      <w:pPr>
+        <w:rPr>
+          <w:rFonts w:ascii="Times New Roman" w:hAnsi="Times New Roman" w:eastAsia="宋体" w:cs="Times New Roman"/>
+          <w:b/>
+          <w:sz w:val="28"/>
+        </w:rPr>
+        <w:ind w:firstLineChars="200"/>
+        <w:spacing w:line="360" w:lineRule="auto"/>
+      </w:pPr>
+      <w:r>
+        <w:rPr>
+          <w:rFonts w:ascii="Times New Roman" w:hAnsi="Times New Roman" w:eastAsia="宋体"/>
+          <w:sz w:val="24"/>
+        </w:rPr>
+        <w:t xml:space="preserve">图 3-8 中灰线为由拟合参数生成的理论曲线，圆点为锁相实测，方块为峰峰值直接测量。可以看到三条信息：一是实测点与理论曲线在通带内几乎重合；二是 300kHz 之后方块点明显高于圆点，说明峰峰值已失效；三是相频曲线在中频段穿过 90°，高频段继续下探。</w:t>
+      </w:r>
+    </w:p>
     <w:p>
       <w:pPr>
         <w:rPr>

</xml_diff>